<commit_message>
Additional work on first draft
</commit_message>
<xml_diff>
--- a/DSL_SEASUG-2026_Paper_Draft1.docx
+++ b/DSL_SEASUG-2026_Paper_Draft1.docx
@@ -30,29 +30,7 @@
           <w:sz w:val="20"/>
           <w:szCs w:val="20"/>
         </w:rPr>
-        <w:t xml:space="preserve">SEASUG </w:t>
-      </w:r>
-      <w:proofErr w:type="gramStart"/>
-      <w:r>
-        <w:rPr>
-          <w:b/>
-          <w:bCs/>
-          <w:color w:val="000000"/>
-          <w:sz w:val="20"/>
-          <w:szCs w:val="20"/>
-        </w:rPr>
-        <w:t>Paper ###-</w:t>
-      </w:r>
-      <w:proofErr w:type="gramEnd"/>
-      <w:r>
-        <w:rPr>
-          <w:b/>
-          <w:bCs/>
-          <w:color w:val="000000"/>
-          <w:sz w:val="20"/>
-          <w:szCs w:val="20"/>
-        </w:rPr>
-        <w:t>2026</w:t>
+        <w:t>SEASUG Paper ###-2026</w:t>
       </w:r>
     </w:p>
     <w:p>
@@ -83,29 +61,7 @@
           <w:sz w:val="26"/>
           <w:szCs w:val="26"/>
         </w:rPr>
-        <w:t xml:space="preserve">A Domain-Specific Computer Language for Market Monitoring: </w:t>
-      </w:r>
-      <w:proofErr w:type="gramStart"/>
-      <w:r>
-        <w:rPr>
-          <w:b/>
-          <w:bCs/>
-          <w:color w:val="000000"/>
-          <w:sz w:val="26"/>
-          <w:szCs w:val="26"/>
-        </w:rPr>
-        <w:t>the</w:t>
-      </w:r>
-      <w:proofErr w:type="gramEnd"/>
-      <w:r>
-        <w:rPr>
-          <w:b/>
-          <w:bCs/>
-          <w:color w:val="000000"/>
-          <w:sz w:val="26"/>
-          <w:szCs w:val="26"/>
-        </w:rPr>
-        <w:t xml:space="preserve"> Missing Link Between Thoughts and SAS®</w:t>
+        <w:t>A Domain-Specific Computer Language for Market Monitoring: the Missing Link Between Thoughts and SAS®</w:t>
       </w:r>
     </w:p>
     <w:p>
@@ -154,50 +110,23 @@
       </w:r>
     </w:p>
     <w:p>
-      <w:pPr>
-        <w:spacing w:line="360" w:lineRule="auto"/>
-        <w:rPr>
-          <w:sz w:val="20"/>
-          <w:szCs w:val="20"/>
-        </w:rPr>
-      </w:pPr>
-      <w:r>
-        <w:rPr>
-          <w:sz w:val="20"/>
-          <w:szCs w:val="20"/>
-        </w:rPr>
-        <w:t>This paper presents a proof-of-concept design and implementation of a domain-specific language (DSL) for use in energy market monitoring. Energy markets are complex systems that enable market participants to economically trade energy at wholesale rates. Market monitors analyze these markets and screen for manipulative behavior, often using SAS for data extraction, transformation, and analysis.</w:t>
-      </w:r>
-    </w:p>
-    <w:p>
-      <w:pPr>
-        <w:spacing w:line="360" w:lineRule="auto"/>
-        <w:rPr>
-          <w:sz w:val="20"/>
-          <w:szCs w:val="20"/>
-        </w:rPr>
-      </w:pPr>
-      <w:r>
-        <w:rPr>
-          <w:sz w:val="20"/>
-          <w:szCs w:val="20"/>
-        </w:rPr>
+      <w:r>
+        <w:t>This paper presents a proof-of-concept design and implementation of a domain-specific language (DSL) for use in energy market monitoring. Energy markets are complex systems that enable market participants to economically trade energy at wholesale rates. Market monitors analyze these markets and screen for manipulative behavior, often using SAS</w:t>
+      </w:r>
+      <w:r>
+        <w:t>®</w:t>
+      </w:r>
+      <w:r>
+        <w:t xml:space="preserve"> for data extraction, transformation, and analysis.</w:t>
+      </w:r>
+    </w:p>
+    <w:p>
+      <w:r>
         <w:t>While SAS is a well-established platform for working with data, many market monitors are not expert computer programmers. DSLs enable non-programmers to solve problems without requiring a background in software development. This paper presents a DSL that aims to alleviate this limitation by enabling a monitoring analyst to specify data analyses in an intuitive way that better suits their background and training. It then transpiles their output into valid SAS code, leveraging SAS data sets for data management and SAS procedures, DATA step programming, and SAS macros to handle complex functionality.</w:t>
       </w:r>
     </w:p>
     <w:p>
-      <w:pPr>
-        <w:spacing w:line="360" w:lineRule="auto"/>
-        <w:rPr>
-          <w:sz w:val="20"/>
-          <w:szCs w:val="20"/>
-        </w:rPr>
-      </w:pPr>
-      <w:r>
-        <w:rPr>
-          <w:sz w:val="20"/>
-          <w:szCs w:val="20"/>
-        </w:rPr>
+      <w:r>
         <w:t>This paper, additionally, demonstrates the flexibility of this proposed design by providing example scripts that satisfy several use cases of this system. These use cases were identified by an anonymous panel of market monitors as part of a Delphi study.</w:t>
       </w:r>
     </w:p>
@@ -284,7 +213,117 @@
         <w:pStyle w:val="Heading3"/>
       </w:pPr>
       <w:r>
-        <w:t>Why SAS?</w:t>
+        <w:t>Why SAS</w:t>
+      </w:r>
+      <w:r>
+        <w:t>®</w:t>
+      </w:r>
+      <w:r>
+        <w:t>?</w:t>
+      </w:r>
+    </w:p>
+    <w:p>
+      <w:r>
+        <w:t xml:space="preserve">Using SAS as the target language for this DSL comes with several advantages. </w:t>
+      </w:r>
+      <w:r>
+        <w:t xml:space="preserve">While the design and implementation of this language </w:t>
+      </w:r>
+      <w:r>
+        <w:t>provide</w:t>
+      </w:r>
+      <w:r>
+        <w:t xml:space="preserve"> a parser and language transpiler </w:t>
+      </w:r>
+      <w:r>
+        <w:t>to effectuate</w:t>
+      </w:r>
+      <w:r>
+        <w:t xml:space="preserve"> the</w:t>
+      </w:r>
+      <w:r>
+        <w:t xml:space="preserve"> execution of the language, there are other components that are required to provide users with a functional analysis system. These main components include a data processing engine, a reliable data typing scheme, and ca</w:t>
+      </w:r>
+      <w:r>
+        <w:t>p</w:t>
+      </w:r>
+      <w:r>
+        <w:t>abilities for data visualization and basic cartography.</w:t>
+      </w:r>
+    </w:p>
+    <w:p>
+      <w:r>
+        <w:t xml:space="preserve">The SAS ecosystem satisfies each of these system requirements. BASE SAS and SAS/ACCESS provide mechanisms for </w:t>
+      </w:r>
+      <w:r>
+        <w:t>processing data, as well as importing and</w:t>
+      </w:r>
+      <w:r>
+        <w:t xml:space="preserve"> exporting </w:t>
+      </w:r>
+      <w:r>
+        <w:t xml:space="preserve">that </w:t>
+      </w:r>
+      <w:r>
+        <w:t xml:space="preserve">data from a variety of </w:t>
+      </w:r>
+      <w:r>
+        <w:t xml:space="preserve">external </w:t>
+      </w:r>
+      <w:r>
+        <w:t>systems (including relational databases). When data is loaded from a source system</w:t>
+      </w:r>
+      <w:r>
+        <w:t>,</w:t>
+      </w:r>
+      <w:r>
+        <w:t xml:space="preserve"> SAS </w:t>
+      </w:r>
+      <w:r>
+        <w:t>houses</w:t>
+      </w:r>
+      <w:r>
+        <w:t xml:space="preserve"> that data in SAS datasets</w:t>
+      </w:r>
+      <w:r>
+        <w:t>. These datasets, in turn,</w:t>
+      </w:r>
+      <w:r>
+        <w:t xml:space="preserve"> </w:t>
+      </w:r>
+      <w:r>
+        <w:t>provide a r</w:t>
+      </w:r>
+      <w:r>
+        <w:t xml:space="preserve">eliable </w:t>
+      </w:r>
+      <w:r>
+        <w:t xml:space="preserve">and universal </w:t>
+      </w:r>
+      <w:r>
+        <w:t xml:space="preserve">API for data processing across all </w:t>
+      </w:r>
+      <w:r>
+        <w:t xml:space="preserve">other </w:t>
+      </w:r>
+      <w:r>
+        <w:t xml:space="preserve">SAS components. BASE SAS also ships with a data typing system, so the upstream DSL does not have to enforce strict typing as part of the syntax (which translates to less cognitive burden on the user). </w:t>
+      </w:r>
+    </w:p>
+    <w:p>
+      <w:r>
+        <w:t>Additionally, the Output Delivery System (ODS) that ships with SAS provides first-class citizens for generating and formatting both data visualization graphs and spatial maps. The ODS principally provides this functionality through the SGMAP and SGPLOT procedures, respectively.</w:t>
+      </w:r>
+    </w:p>
+    <w:p>
+      <w:r>
+        <w:t xml:space="preserve">With each of these infrastructural components available within one platform, </w:t>
+      </w:r>
+      <w:r>
+        <w:t>the DSL</w:t>
+      </w:r>
+      <w:r>
+        <w:t xml:space="preserve"> can remain focused on allowing the user to write intuitive data logic. The DSL can then offload any technical complexity to SAS and return results and error messages back to the user.</w:t>
       </w:r>
     </w:p>
     <w:p>
@@ -302,23 +341,22 @@
       <w:bookmarkStart w:id="3" w:name="_heading=h.v04ytp5vmndc" w:colFirst="0" w:colLast="0"/>
       <w:bookmarkEnd w:id="3"/>
       <w:r>
+        <w:lastRenderedPageBreak/>
         <w:t>Delphi study methodology</w:t>
       </w:r>
     </w:p>
     <w:p>
-      <w:pPr>
-        <w:spacing w:line="360" w:lineRule="auto"/>
-        <w:rPr>
-          <w:sz w:val="20"/>
-          <w:szCs w:val="20"/>
-        </w:rPr>
-      </w:pPr>
-      <w:r>
-        <w:rPr>
-          <w:sz w:val="20"/>
-          <w:szCs w:val="20"/>
-        </w:rPr>
-        <w:t xml:space="preserve">To identify relevant use cases during the implementation of this DSL, the researchers chose to proctor a Delphi study. Eligibility to participate in this study was determined by only two (2) requirements: </w:t>
+      <w:r>
+        <w:t>To identify relevant use cases during the implementation of this DSL, the researchers chose to proctor a Delphi study</w:t>
+      </w:r>
+      <w:r>
+        <w:rPr>
+          <w:rStyle w:val="FootnoteReference"/>
+        </w:rPr>
+        <w:footnoteReference w:id="1"/>
+      </w:r>
+      <w:r>
+        <w:t xml:space="preserve">. Eligibility to participate in this study was determined by only two (2) requirements: </w:t>
       </w:r>
     </w:p>
     <w:p>
@@ -326,19 +364,10 @@
         <w:pStyle w:val="ListParagraph"/>
         <w:numPr>
           <w:ilvl w:val="0"/>
-          <w:numId w:val="11"/>
+          <w:numId w:val="13"/>
         </w:numPr>
-        <w:spacing w:line="360" w:lineRule="auto"/>
-        <w:rPr>
-          <w:sz w:val="20"/>
-          <w:szCs w:val="20"/>
-        </w:rPr>
-      </w:pPr>
-      <w:r>
-        <w:rPr>
-          <w:sz w:val="20"/>
-          <w:szCs w:val="20"/>
-        </w:rPr>
+      </w:pPr>
+      <w:r>
         <w:t>The participant must be over the age of 18</w:t>
       </w:r>
     </w:p>
@@ -347,73 +376,36 @@
         <w:pStyle w:val="ListParagraph"/>
         <w:numPr>
           <w:ilvl w:val="0"/>
-          <w:numId w:val="11"/>
+          <w:numId w:val="13"/>
         </w:numPr>
-        <w:spacing w:line="360" w:lineRule="auto"/>
-        <w:rPr>
-          <w:sz w:val="20"/>
-          <w:szCs w:val="20"/>
-        </w:rPr>
-      </w:pPr>
-      <w:r>
-        <w:rPr>
-          <w:sz w:val="20"/>
-          <w:szCs w:val="20"/>
-        </w:rPr>
-        <w:lastRenderedPageBreak/>
+      </w:pPr>
+      <w:r>
         <w:t>The participant must be a member of the Energy Intermarket Surveillance Group (EISG)</w:t>
       </w:r>
       <w:r>
         <w:rPr>
-          <w:sz w:val="20"/>
-          <w:szCs w:val="20"/>
           <w:vertAlign w:val="superscript"/>
         </w:rPr>
-        <w:footnoteReference w:id="1"/>
-      </w:r>
-    </w:p>
-    <w:p>
-      <w:pPr>
-        <w:spacing w:line="360" w:lineRule="auto"/>
-        <w:rPr>
-          <w:sz w:val="20"/>
-          <w:szCs w:val="20"/>
-        </w:rPr>
-      </w:pPr>
-      <w:r>
-        <w:rPr>
-          <w:sz w:val="20"/>
-          <w:szCs w:val="20"/>
-        </w:rPr>
+        <w:footnoteReference w:id="2"/>
+      </w:r>
+    </w:p>
+    <w:p>
+      <w:r>
         <w:t>These eligibility requirements were introduced to both adhere to responsible research ethics</w:t>
       </w:r>
       <w:r>
         <w:rPr>
-          <w:rStyle w:val="FootnoteReference"/>
-          <w:sz w:val="20"/>
-          <w:szCs w:val="20"/>
-        </w:rPr>
-        <w:footnoteReference w:id="2"/>
-      </w:r>
-      <w:r>
-        <w:rPr>
-          <w:sz w:val="20"/>
-          <w:szCs w:val="20"/>
-        </w:rPr>
+          <w:vertAlign w:val="superscript"/>
+        </w:rPr>
+        <w:footnoteReference w:id="3"/>
+      </w:r>
+      <w:r>
         <w:t xml:space="preserve"> and to establish a definition of “expert opinion” provided by each participant. Plainly, this ensured that the survey questions posed in this study were answered by the same individuals that </w:t>
       </w:r>
       <w:r>
-        <w:rPr>
-          <w:sz w:val="20"/>
-          <w:szCs w:val="20"/>
-        </w:rPr>
         <w:t>may</w:t>
       </w:r>
       <w:r>
-        <w:rPr>
-          <w:sz w:val="20"/>
-          <w:szCs w:val="20"/>
-        </w:rPr>
         <w:t xml:space="preserve"> use a purpose-made DSL for energy market analytics. The study was conducted in two (2) rounds, where a round corresponds to a group of survey questions that were provided to the participants. These included a list of free-form text responses, multiple choice questions, and questions provided in a Likert format.</w:t>
       </w:r>
     </w:p>
@@ -426,85 +418,31 @@
       </w:r>
     </w:p>
     <w:p>
-      <w:pPr>
-        <w:spacing w:line="360" w:lineRule="auto"/>
-        <w:rPr>
-          <w:sz w:val="20"/>
-          <w:szCs w:val="20"/>
-        </w:rPr>
-      </w:pPr>
-      <w:r>
-        <w:rPr>
-          <w:sz w:val="20"/>
-          <w:szCs w:val="20"/>
-        </w:rPr>
+      <w:r>
         <w:t xml:space="preserve">At the time of administering this study, the EISG held a roster of 131 active members. </w:t>
       </w:r>
       <w:r>
-        <w:rPr>
-          <w:sz w:val="20"/>
-          <w:szCs w:val="20"/>
-        </w:rPr>
         <w:t xml:space="preserve">Round #1 yielded a roughly 15% response rate (19 confirmed individuals participated in the first round). Only 11 of the original 19 participants elected to respond to round #2 (roughly a 58% retention rate of the original participants). Of the panelists, 16 of the EISG members were US-based market monitors. The remaining 3 worked for an internationally based market monitoring unit. </w:t>
       </w:r>
       <w:r>
-        <w:rPr>
-          <w:sz w:val="20"/>
-          <w:szCs w:val="20"/>
-        </w:rPr>
         <w:fldChar w:fldCharType="begin"/>
       </w:r>
       <w:r>
-        <w:rPr>
-          <w:sz w:val="20"/>
-          <w:szCs w:val="20"/>
-        </w:rPr>
         <w:instrText xml:space="preserve"> REF _Ref230708375 \h </w:instrText>
       </w:r>
       <w:r>
-        <w:rPr>
-          <w:sz w:val="20"/>
-          <w:szCs w:val="20"/>
-        </w:rPr>
-      </w:r>
-      <w:r>
-        <w:rPr>
-          <w:sz w:val="20"/>
-          <w:szCs w:val="20"/>
-        </w:rPr>
+        <w:instrText xml:space="preserve"> \* MERGEFORMAT </w:instrText>
+      </w:r>
+      <w:r>
         <w:fldChar w:fldCharType="separate"/>
       </w:r>
       <w:r>
-        <w:rPr>
-          <w:i/>
-          <w:iCs/>
-          <w:sz w:val="20"/>
-          <w:szCs w:val="20"/>
-        </w:rPr>
-        <w:t xml:space="preserve">Figure </w:t>
-      </w:r>
-      <w:r>
-        <w:rPr>
-          <w:i/>
-          <w:iCs/>
-          <w:noProof/>
-          <w:sz w:val="20"/>
-          <w:szCs w:val="20"/>
-        </w:rPr>
-        <w:t>1</w:t>
-      </w:r>
-      <w:r>
-        <w:rPr>
-          <w:sz w:val="20"/>
-          <w:szCs w:val="20"/>
-        </w:rPr>
+        <w:t>Figure 1</w:t>
+      </w:r>
+      <w:r>
         <w:fldChar w:fldCharType="end"/>
       </w:r>
       <w:r>
-        <w:rPr>
-          <w:sz w:val="20"/>
-          <w:szCs w:val="20"/>
-        </w:rPr>
         <w:t xml:space="preserve"> professional role mix of the panelists, indicating that market monitoring analysts make up the largest portion of the panelists, with a mix of other roles including management, economists, data scientists, and a developer.</w:t>
       </w:r>
     </w:p>
@@ -857,28 +795,15 @@
         <w:pStyle w:val="Heading3"/>
       </w:pPr>
       <w:r>
-        <w:t xml:space="preserve">Parser and </w:t>
-      </w:r>
-      <w:proofErr w:type="spellStart"/>
-      <w:r>
-        <w:t>transpiler</w:t>
-      </w:r>
-      <w:proofErr w:type="spellEnd"/>
-      <w:r>
-        <w:t xml:space="preserve"> architecture</w:t>
+        <w:t>Parser and transpiler architecture</w:t>
       </w:r>
     </w:p>
     <w:p>
       <w:pPr>
         <w:pStyle w:val="Heading3"/>
       </w:pPr>
-      <w:proofErr w:type="spellStart"/>
-      <w:r>
-        <w:t>Transpilation</w:t>
-      </w:r>
-      <w:proofErr w:type="spellEnd"/>
-      <w:r>
-        <w:t xml:space="preserve"> strategy</w:t>
+      <w:r>
+        <w:t>Transpilation strategy</w:t>
       </w:r>
     </w:p>
     <w:p>
@@ -893,11 +818,9 @@
       <w:pPr>
         <w:pStyle w:val="Heading1"/>
       </w:pPr>
-      <w:proofErr w:type="gramStart"/>
       <w:r>
         <w:t>Evaluation</w:t>
       </w:r>
-      <w:proofErr w:type="gramEnd"/>
       <w:r>
         <w:t xml:space="preserve"> and Walkthrough</w:t>
       </w:r>
@@ -952,7 +875,13 @@
     </w:p>
     <w:p>
       <w:r>
-        <w:t xml:space="preserve">Given that this paper provides a proof-of-concept for this DSL, there are several limitations with the implementation of this solution, namely: </w:t>
+        <w:t xml:space="preserve">Given that this paper provides a proof-of-concept for this DSL, there are several limitations with the </w:t>
+      </w:r>
+      <w:r>
+        <w:t xml:space="preserve">current </w:t>
+      </w:r>
+      <w:r>
+        <w:t xml:space="preserve">implementation of this solution, namely: </w:t>
       </w:r>
     </w:p>
     <w:p>
@@ -985,6 +914,105 @@
         <w:pStyle w:val="Heading3"/>
       </w:pPr>
       <w:r>
+        <w:t>Improvement Possibilities</w:t>
+      </w:r>
+    </w:p>
+    <w:p>
+      <w:pPr>
+        <w:rPr>
+          <w:highlight w:val="yellow"/>
+        </w:rPr>
+      </w:pPr>
+      <w:r>
+        <w:rPr>
+          <w:highlight w:val="yellow"/>
+        </w:rPr>
+        <w:t>The exciting section!</w:t>
+      </w:r>
+      <w:r>
+        <w:rPr>
+          <w:highlight w:val="yellow"/>
+        </w:rPr>
+        <w:t xml:space="preserve"> Possibilities should include: </w:t>
+      </w:r>
+    </w:p>
+    <w:p>
+      <w:pPr>
+        <w:pStyle w:val="ListParagraph"/>
+        <w:numPr>
+          <w:ilvl w:val="0"/>
+          <w:numId w:val="14"/>
+        </w:numPr>
+        <w:rPr>
+          <w:highlight w:val="yellow"/>
+        </w:rPr>
+      </w:pPr>
+      <w:r>
+        <w:rPr>
+          <w:highlight w:val="yellow"/>
+        </w:rPr>
+        <w:t>Language Server Protocol (LSP) and editor support</w:t>
+      </w:r>
+    </w:p>
+    <w:p>
+      <w:pPr>
+        <w:pStyle w:val="ListParagraph"/>
+        <w:numPr>
+          <w:ilvl w:val="0"/>
+          <w:numId w:val="14"/>
+        </w:numPr>
+        <w:rPr>
+          <w:highlight w:val="yellow"/>
+        </w:rPr>
+      </w:pPr>
+      <w:r>
+        <w:rPr>
+          <w:highlight w:val="yellow"/>
+        </w:rPr>
+        <w:t>Enhanced error handling and reporting</w:t>
+      </w:r>
+    </w:p>
+    <w:p>
+      <w:pPr>
+        <w:pStyle w:val="ListParagraph"/>
+        <w:numPr>
+          <w:ilvl w:val="0"/>
+          <w:numId w:val="14"/>
+        </w:numPr>
+        <w:rPr>
+          <w:highlight w:val="yellow"/>
+        </w:rPr>
+      </w:pPr>
+      <w:r>
+        <w:rPr>
+          <w:highlight w:val="yellow"/>
+        </w:rPr>
+        <w:t>Connectivity with the SAS platform (either a traditional SAS 9.4 Server or the Viya cloud environment) – keeps the user from having to take the code and manually execute it</w:t>
+      </w:r>
+    </w:p>
+    <w:p>
+      <w:pPr>
+        <w:pStyle w:val="ListParagraph"/>
+        <w:numPr>
+          <w:ilvl w:val="0"/>
+          <w:numId w:val="14"/>
+        </w:numPr>
+        <w:rPr>
+          <w:highlight w:val="yellow"/>
+        </w:rPr>
+      </w:pPr>
+      <w:r>
+        <w:rPr>
+          <w:highlight w:val="yellow"/>
+        </w:rPr>
+        <w:t>Integration with agentic AI (use the user’s DSL code as a “deterministic prompt”, to then build executable output code).</w:t>
+      </w:r>
+    </w:p>
+    <w:p>
+      <w:pPr>
+        <w:pStyle w:val="Heading3"/>
+      </w:pPr>
+      <w:r>
         <w:t>Future Work</w:t>
       </w:r>
     </w:p>
@@ -1003,16 +1031,73 @@
         <w:rPr>
           <w:highlight w:val="yellow"/>
         </w:rPr>
-        <w:t xml:space="preserve">References are </w:t>
-      </w:r>
-      <w:proofErr w:type="gramStart"/>
+        <w:t>References are in-progress</w:t>
+      </w:r>
+    </w:p>
+    <w:p>
       <w:r>
         <w:rPr>
           <w:highlight w:val="yellow"/>
         </w:rPr>
-        <w:t>in-progress</w:t>
-      </w:r>
-      <w:proofErr w:type="gramEnd"/>
+        <w:t xml:space="preserve">[1] </w:t>
+      </w:r>
+      <w:r>
+        <w:rPr>
+          <w:highlight w:val="yellow"/>
+        </w:rPr>
+        <w:t>Ruslan Mitkov, </w:t>
+      </w:r>
+      <w:r>
+        <w:rPr>
+          <w:i/>
+          <w:iCs/>
+          <w:highlight w:val="yellow"/>
+        </w:rPr>
+        <w:t>The Oxford handbook of computational linguistics</w:t>
+      </w:r>
+      <w:r>
+        <w:rPr>
+          <w:highlight w:val="yellow"/>
+        </w:rPr>
+        <w:t>. Oxford: Oxford University Press, 2004.</w:t>
+      </w:r>
+    </w:p>
+    <w:p>
+      <w:r>
+        <w:rPr>
+          <w:highlight w:val="yellow"/>
+        </w:rPr>
+        <w:t xml:space="preserve">[2] </w:t>
+      </w:r>
+      <w:r>
+        <w:rPr>
+          <w:highlight w:val="yellow"/>
+        </w:rPr>
+        <w:t>S. Chuenjitwongsa, “How to: Conduct a Delphi Study,” </w:t>
+      </w:r>
+      <w:r>
+        <w:rPr>
+          <w:i/>
+          <w:iCs/>
+          <w:highlight w:val="yellow"/>
+        </w:rPr>
+        <w:t>Cardiff University</w:t>
+      </w:r>
+      <w:r>
+        <w:rPr>
+          <w:highlight w:val="yellow"/>
+        </w:rPr>
+        <w:t xml:space="preserve">, 2017. </w:t>
+      </w:r>
+      <w:hyperlink r:id="rId11" w:history="1">
+        <w:r>
+          <w:rPr>
+            <w:rStyle w:val="Hyperlink"/>
+            <w:highlight w:val="yellow"/>
+          </w:rPr>
+          <w:t>https://www.cardiff.ac.uk/__data/assets/pdf_file/0010/1164961/how_to_conduct_a_delphistudy.pdf</w:t>
+        </w:r>
+      </w:hyperlink>
     </w:p>
     <w:p>
       <w:pPr>
@@ -1035,107 +1120,62 @@
           <w:between w:val="nil"/>
         </w:pBdr>
         <w:spacing w:line="276" w:lineRule="auto"/>
-        <w:rPr>
-          <w:sz w:val="20"/>
-          <w:szCs w:val="20"/>
-        </w:rPr>
-      </w:pPr>
-      <w:r>
-        <w:rPr>
-          <w:sz w:val="20"/>
-          <w:szCs w:val="20"/>
-        </w:rPr>
-        <w:t xml:space="preserve">We would like to acknowledge </w:t>
-      </w:r>
-      <w:r>
-        <w:rPr>
-          <w:sz w:val="20"/>
-          <w:szCs w:val="20"/>
-        </w:rPr>
-        <w:t xml:space="preserve">both </w:t>
-      </w:r>
-      <w:r>
-        <w:rPr>
-          <w:sz w:val="20"/>
-          <w:szCs w:val="20"/>
-        </w:rPr>
-        <w:t>SPP</w:t>
-      </w:r>
-      <w:r>
-        <w:rPr>
-          <w:sz w:val="20"/>
-          <w:szCs w:val="20"/>
-        </w:rPr>
+      </w:pPr>
+      <w:r>
+        <w:t>We would like to acknowledge SPP</w:t>
+      </w:r>
+      <w:r>
         <w:t xml:space="preserve">, the Energy Information Authority (EIA), and DegreeDays.net </w:t>
       </w:r>
       <w:r>
-        <w:rPr>
-          <w:sz w:val="20"/>
-          <w:szCs w:val="20"/>
-        </w:rPr>
         <w:t xml:space="preserve">for providing </w:t>
       </w:r>
       <w:r>
-        <w:rPr>
-          <w:sz w:val="20"/>
-          <w:szCs w:val="20"/>
-        </w:rPr>
         <w:t>sources</w:t>
       </w:r>
       <w:r>
-        <w:rPr>
-          <w:sz w:val="20"/>
-          <w:szCs w:val="20"/>
-        </w:rPr>
         <w:t xml:space="preserve"> of publicly available </w:t>
       </w:r>
       <w:r>
-        <w:rPr>
-          <w:sz w:val="20"/>
-          <w:szCs w:val="20"/>
-        </w:rPr>
         <w:t xml:space="preserve">data </w:t>
       </w:r>
       <w:r>
-        <w:rPr>
-          <w:sz w:val="20"/>
-          <w:szCs w:val="20"/>
-        </w:rPr>
         <w:t xml:space="preserve">which made </w:t>
       </w:r>
       <w:r>
-        <w:rPr>
-          <w:sz w:val="20"/>
-          <w:szCs w:val="20"/>
-        </w:rPr>
         <w:t>the construction and evaluation of this</w:t>
       </w:r>
       <w:r>
-        <w:rPr>
-          <w:sz w:val="20"/>
-          <w:szCs w:val="20"/>
-        </w:rPr>
         <w:t xml:space="preserve"> project possible.</w:t>
       </w:r>
       <w:r>
-        <w:rPr>
-          <w:sz w:val="20"/>
-          <w:szCs w:val="20"/>
-        </w:rPr>
-        <w:t xml:space="preserve"> Readers are encouraged to visit these organization’s respective websites for more information</w:t>
-      </w:r>
-      <w:r>
-        <w:rPr>
-          <w:sz w:val="20"/>
-          <w:szCs w:val="20"/>
-        </w:rPr>
-        <w:t xml:space="preserve"> on public energy data</w:t>
-      </w:r>
-      <w:r>
-        <w:rPr>
-          <w:sz w:val="20"/>
-          <w:szCs w:val="20"/>
-        </w:rPr>
+        <w:t xml:space="preserve"> Readers are encouraged to visit </w:t>
+      </w:r>
+      <w:r>
+        <w:t>the</w:t>
+      </w:r>
+      <w:r>
+        <w:t xml:space="preserve"> </w:t>
+      </w:r>
+      <w:r>
+        <w:t>website</w:t>
+      </w:r>
+      <w:r>
+        <w:t>, for each respective organization,</w:t>
+      </w:r>
+      <w:r>
+        <w:t xml:space="preserve"> for more information</w:t>
+      </w:r>
+      <w:r>
+        <w:t xml:space="preserve"> on </w:t>
+      </w:r>
+      <w:r>
+        <w:t xml:space="preserve">sources of </w:t>
+      </w:r>
+      <w:r>
+        <w:t>energy data</w:t>
+      </w:r>
+      <w:r>
         <w:t>:</w:t>
       </w:r>
     </w:p>
@@ -1155,42 +1195,14 @@
           <w:between w:val="nil"/>
         </w:pBdr>
         <w:spacing w:line="276" w:lineRule="auto"/>
-        <w:rPr>
-          <w:color w:val="000000"/>
-          <w:sz w:val="20"/>
-          <w:szCs w:val="20"/>
-        </w:rPr>
-      </w:pPr>
-      <w:r>
-        <w:rPr>
-          <w:color w:val="000000"/>
-          <w:sz w:val="20"/>
-          <w:szCs w:val="20"/>
-        </w:rPr>
-        <w:t>SPP (n</w:t>
-      </w:r>
-      <w:r>
-        <w:rPr>
-          <w:color w:val="000000"/>
-          <w:sz w:val="20"/>
-          <w:szCs w:val="20"/>
-        </w:rPr>
-        <w:t>ée</w:t>
-      </w:r>
-      <w:r>
-        <w:rPr>
-          <w:color w:val="000000"/>
-          <w:sz w:val="20"/>
-          <w:szCs w:val="20"/>
-        </w:rPr>
-        <w:t xml:space="preserve"> Southwest Power Pool) -- </w:t>
-      </w:r>
-      <w:hyperlink r:id="rId11" w:history="1">
+      </w:pPr>
+      <w:r>
+        <w:t xml:space="preserve">SPP (née Southwest Power Pool) -- </w:t>
+      </w:r>
+      <w:hyperlink r:id="rId12" w:history="1">
         <w:r>
           <w:rPr>
             <w:rStyle w:val="Hyperlink"/>
-            <w:sz w:val="20"/>
-            <w:szCs w:val="20"/>
           </w:rPr>
           <w:t>https://portal.spp.org/groups/integrated-marketplace</w:t>
         </w:r>
@@ -1212,26 +1224,14 @@
           <w:between w:val="nil"/>
         </w:pBdr>
         <w:spacing w:line="276" w:lineRule="auto"/>
-        <w:rPr>
-          <w:color w:val="000000"/>
-          <w:sz w:val="20"/>
-          <w:szCs w:val="20"/>
-        </w:rPr>
-      </w:pPr>
-      <w:r>
-        <w:rPr>
-          <w:color w:val="000000"/>
-          <w:sz w:val="20"/>
-          <w:szCs w:val="20"/>
-        </w:rPr>
+      </w:pPr>
+      <w:r>
         <w:t xml:space="preserve">EIA -- </w:t>
       </w:r>
-      <w:hyperlink r:id="rId12" w:history="1">
+      <w:hyperlink r:id="rId13" w:history="1">
         <w:r>
           <w:rPr>
             <w:rStyle w:val="Hyperlink"/>
-            <w:sz w:val="20"/>
-            <w:szCs w:val="20"/>
           </w:rPr>
           <w:t>https://www.eia.gov/electricity/</w:t>
         </w:r>
@@ -1254,71 +1254,22 @@
         </w:pBdr>
         <w:spacing w:line="276" w:lineRule="auto"/>
         <w:rPr>
-          <w:color w:val="000000"/>
-          <w:sz w:val="20"/>
-          <w:szCs w:val="20"/>
-        </w:rPr>
-      </w:pPr>
-      <w:r>
-        <w:rPr>
-          <w:color w:val="000000"/>
-          <w:sz w:val="20"/>
-          <w:szCs w:val="20"/>
-        </w:rPr>
+          <w:rStyle w:val="Hyperlink"/>
+          <w:color w:val="auto"/>
+          <w:u w:val="none"/>
+        </w:rPr>
+      </w:pPr>
+      <w:r>
         <w:t xml:space="preserve">BizEE Degree Days -- </w:t>
       </w:r>
-      <w:hyperlink r:id="rId13" w:history="1">
+      <w:hyperlink r:id="rId14" w:history="1">
         <w:r>
           <w:rPr>
             <w:rStyle w:val="Hyperlink"/>
-            <w:sz w:val="20"/>
-            <w:szCs w:val="20"/>
           </w:rPr>
           <w:t>https://www.degreedays.net/</w:t>
         </w:r>
       </w:hyperlink>
-    </w:p>
-    <w:p>
-      <w:pPr>
-        <w:pStyle w:val="Heading1"/>
-      </w:pPr>
-      <w:bookmarkStart w:id="11" w:name="_heading=h.hs7c92y1og9i" w:colFirst="0" w:colLast="0"/>
-      <w:bookmarkEnd w:id="11"/>
-      <w:r>
-        <w:t>Recommended Reading</w:t>
-      </w:r>
-    </w:p>
-    <w:p>
-      <w:r>
-        <w:rPr>
-          <w:highlight w:val="yellow"/>
-        </w:rPr>
-        <w:t xml:space="preserve">Recommended reading in progress… Steven Stoft’s </w:t>
-      </w:r>
-      <w:r>
-        <w:rPr>
-          <w:i/>
-          <w:iCs/>
-          <w:highlight w:val="yellow"/>
-        </w:rPr>
-        <w:t>Power System Economics</w:t>
-      </w:r>
-      <w:r>
-        <w:rPr>
-          <w:highlight w:val="yellow"/>
-        </w:rPr>
-        <w:t xml:space="preserve"> at a bare minimum.</w:t>
-      </w:r>
-    </w:p>
-    <w:p>
-      <w:pPr>
-        <w:pStyle w:val="Heading1"/>
-      </w:pPr>
-      <w:bookmarkStart w:id="12" w:name="_heading=h.w80t7yem59fv" w:colFirst="0" w:colLast="0"/>
-      <w:bookmarkEnd w:id="12"/>
-      <w:r>
-        <w:t>Contact Information</w:t>
-      </w:r>
     </w:p>
     <w:p>
       <w:pPr>
@@ -1330,19 +1281,58 @@
           <w:right w:val="nil"/>
           <w:between w:val="nil"/>
         </w:pBdr>
-        <w:rPr>
-          <w:color w:val="000000"/>
-          <w:sz w:val="20"/>
-          <w:szCs w:val="20"/>
-        </w:rPr>
-      </w:pPr>
-      <w:r>
-        <w:rPr>
-          <w:color w:val="000000"/>
-          <w:sz w:val="20"/>
-          <w:szCs w:val="20"/>
-        </w:rPr>
-        <w:t>Your comments and questions are valued and encouraged. Contact the author(s) at:</w:t>
+        <w:spacing w:line="276" w:lineRule="auto"/>
+      </w:pPr>
+      <w:r>
+        <w:t>Additionally, Eric would like to acknowledge both Mark Rouse and Bartosz</w:t>
+      </w:r>
+      <w:r>
+        <w:t xml:space="preserve"> “Bart”</w:t>
+      </w:r>
+      <w:r>
+        <w:t xml:space="preserve"> Jablonski for inspiring excitement within him around SAS.</w:t>
+      </w:r>
+    </w:p>
+    <w:p>
+      <w:pPr>
+        <w:pStyle w:val="Heading1"/>
+      </w:pPr>
+      <w:bookmarkStart w:id="11" w:name="_heading=h.hs7c92y1og9i" w:colFirst="0" w:colLast="0"/>
+      <w:bookmarkEnd w:id="11"/>
+      <w:r>
+        <w:t>Recommended Reading</w:t>
+      </w:r>
+    </w:p>
+    <w:p>
+      <w:r>
+        <w:rPr>
+          <w:highlight w:val="yellow"/>
+        </w:rPr>
+        <w:t xml:space="preserve">Recommended reading in progress… Steven Stoft’s </w:t>
+      </w:r>
+      <w:r>
+        <w:rPr>
+          <w:i/>
+          <w:iCs/>
+          <w:highlight w:val="yellow"/>
+        </w:rPr>
+        <w:t>Power System Economics</w:t>
+      </w:r>
+      <w:r>
+        <w:rPr>
+          <w:highlight w:val="yellow"/>
+        </w:rPr>
+        <w:t xml:space="preserve"> at a bare minimum.</w:t>
+      </w:r>
+    </w:p>
+    <w:p>
+      <w:pPr>
+        <w:pStyle w:val="Heading1"/>
+      </w:pPr>
+      <w:bookmarkStart w:id="12" w:name="_heading=h.w80t7yem59fv" w:colFirst="0" w:colLast="0"/>
+      <w:bookmarkEnd w:id="12"/>
+      <w:r>
+        <w:t>Contact Information</w:t>
       </w:r>
     </w:p>
     <w:p>
@@ -1355,12 +1345,163 @@
           <w:right w:val="nil"/>
           <w:between w:val="nil"/>
         </w:pBdr>
-        <w:rPr>
-          <w:color w:val="000000"/>
-          <w:sz w:val="20"/>
-          <w:szCs w:val="20"/>
-        </w:rPr>
-      </w:pPr>
+        <w:spacing w:line="276" w:lineRule="auto"/>
+      </w:pPr>
+      <w:r>
+        <w:t>Your comments and questions are valued and encouraged. Contact the author(s) at:</w:t>
+      </w:r>
+    </w:p>
+    <w:p>
+      <w:pPr>
+        <w:widowControl/>
+        <w:pBdr>
+          <w:top w:val="nil"/>
+          <w:left w:val="nil"/>
+          <w:bottom w:val="nil"/>
+          <w:right w:val="nil"/>
+          <w:between w:val="nil"/>
+        </w:pBdr>
+        <w:spacing w:line="276" w:lineRule="auto"/>
+        <w:ind w:left="720"/>
+      </w:pPr>
+      <w:r>
+        <w:rPr>
+          <w:b/>
+          <w:bCs/>
+        </w:rPr>
+        <w:t>Eric C. Grasby</w:t>
+      </w:r>
+      <w:r>
+        <w:t xml:space="preserve"> </w:t>
+      </w:r>
+      <w:r>
+        <w:br/>
+      </w:r>
+      <w:r>
+        <w:t xml:space="preserve">Senior Market Monitor, Southwest Power Pool, Inc. </w:t>
+      </w:r>
+      <w:r>
+        <w:br/>
+      </w:r>
+      <w:r>
+        <w:t>Doctoral Candidate, UA Little Rock, Department of Information Science</w:t>
+      </w:r>
+      <w:r>
+        <w:br/>
+      </w:r>
+      <w:hyperlink r:id="rId15" w:history="1">
+        <w:r>
+          <w:rPr>
+            <w:rStyle w:val="Hyperlink"/>
+          </w:rPr>
+          <w:t>ecgrasby@ualr.edu</w:t>
+        </w:r>
+      </w:hyperlink>
+      <w:r>
+        <w:br/>
+      </w:r>
+      <w:hyperlink r:id="rId16" w:history="1">
+        <w:r>
+          <w:rPr>
+            <w:rStyle w:val="Hyperlink"/>
+          </w:rPr>
+          <w:t>https://linkedin.com/in/echarlesgrasby</w:t>
+        </w:r>
+      </w:hyperlink>
+    </w:p>
+    <w:p>
+      <w:pPr>
+        <w:widowControl/>
+        <w:pBdr>
+          <w:top w:val="nil"/>
+          <w:left w:val="nil"/>
+          <w:bottom w:val="nil"/>
+          <w:right w:val="nil"/>
+          <w:between w:val="nil"/>
+        </w:pBdr>
+        <w:spacing w:line="276" w:lineRule="auto"/>
+        <w:ind w:left="720"/>
+      </w:pPr>
+      <w:r>
+        <w:rPr>
+          <w:b/>
+          <w:bCs/>
+        </w:rPr>
+        <w:t>Dr. J. Daniel Berleant</w:t>
+      </w:r>
+      <w:r>
+        <w:br/>
+      </w:r>
+      <w:r>
+        <w:t>Professor, UA Little Rock, Department of Information Science</w:t>
+      </w:r>
+      <w:r>
+        <w:br/>
+      </w:r>
+      <w:hyperlink r:id="rId17" w:history="1">
+        <w:r>
+          <w:rPr>
+            <w:rStyle w:val="Hyperlink"/>
+          </w:rPr>
+          <w:t>jdberleant@ualr.edu</w:t>
+        </w:r>
+      </w:hyperlink>
+      <w:r>
+        <w:br/>
+      </w:r>
+      <w:hyperlink r:id="rId18" w:history="1">
+        <w:r>
+          <w:rPr>
+            <w:rStyle w:val="Hyperlink"/>
+          </w:rPr>
+          <w:t>https://www.linkedin.com/in/daniel-berleant-4938451/</w:t>
+        </w:r>
+      </w:hyperlink>
+    </w:p>
+    <w:p>
+      <w:pPr>
+        <w:widowControl/>
+        <w:pBdr>
+          <w:top w:val="nil"/>
+          <w:left w:val="nil"/>
+          <w:bottom w:val="nil"/>
+          <w:right w:val="nil"/>
+          <w:between w:val="nil"/>
+        </w:pBdr>
+        <w:spacing w:line="276" w:lineRule="auto"/>
+      </w:pPr>
+    </w:p>
+    <w:p>
+      <w:pPr>
+        <w:widowControl/>
+        <w:pBdr>
+          <w:top w:val="nil"/>
+          <w:left w:val="nil"/>
+          <w:bottom w:val="nil"/>
+          <w:right w:val="nil"/>
+          <w:between w:val="nil"/>
+        </w:pBdr>
+        <w:spacing w:line="276" w:lineRule="auto"/>
+      </w:pPr>
+      <w:r>
+        <w:t xml:space="preserve">SAS and all other SAS Institute Inc. product or service names are registered trademarks of SAS Institute Inc. in the USA and other countries. ® indicates USA registration. </w:t>
+      </w:r>
+    </w:p>
+    <w:p>
+      <w:pPr>
+        <w:widowControl/>
+        <w:pBdr>
+          <w:top w:val="nil"/>
+          <w:left w:val="nil"/>
+          <w:bottom w:val="nil"/>
+          <w:right w:val="nil"/>
+          <w:between w:val="nil"/>
+        </w:pBdr>
+        <w:spacing w:line="276" w:lineRule="auto"/>
+      </w:pPr>
+      <w:r>
+        <w:t>Other brand and product names are trademarks of their respective companies.</w:t>
+      </w:r>
     </w:p>
     <w:p>
       <w:pPr>
@@ -1375,403 +1516,6 @@
         <w:spacing w:after="0"/>
         <w:ind w:left="432"/>
         <w:rPr>
-          <w:b/>
-          <w:bCs/>
-          <w:color w:val="000000"/>
-          <w:sz w:val="20"/>
-          <w:szCs w:val="20"/>
-        </w:rPr>
-      </w:pPr>
-      <w:r>
-        <w:rPr>
-          <w:b/>
-          <w:bCs/>
-          <w:color w:val="000000"/>
-          <w:sz w:val="20"/>
-          <w:szCs w:val="20"/>
-        </w:rPr>
-        <w:t xml:space="preserve">Eric C. Grasby </w:t>
-      </w:r>
-    </w:p>
-    <w:p>
-      <w:pPr>
-        <w:widowControl/>
-        <w:pBdr>
-          <w:top w:val="nil"/>
-          <w:left w:val="nil"/>
-          <w:bottom w:val="nil"/>
-          <w:right w:val="nil"/>
-          <w:between w:val="nil"/>
-        </w:pBdr>
-        <w:spacing w:after="0"/>
-        <w:ind w:left="432"/>
-        <w:rPr>
-          <w:color w:val="000000"/>
-          <w:sz w:val="20"/>
-          <w:szCs w:val="20"/>
-        </w:rPr>
-      </w:pPr>
-      <w:r>
-        <w:rPr>
-          <w:color w:val="000000"/>
-          <w:sz w:val="20"/>
-          <w:szCs w:val="20"/>
-        </w:rPr>
-        <w:t xml:space="preserve">Senior Market Monitor, Southwest Power Pool, Inc. </w:t>
-      </w:r>
-    </w:p>
-    <w:p>
-      <w:pPr>
-        <w:widowControl/>
-        <w:pBdr>
-          <w:top w:val="nil"/>
-          <w:left w:val="nil"/>
-          <w:bottom w:val="nil"/>
-          <w:right w:val="nil"/>
-          <w:between w:val="nil"/>
-        </w:pBdr>
-        <w:spacing w:after="0"/>
-        <w:ind w:left="432"/>
-        <w:rPr>
-          <w:color w:val="000000"/>
-          <w:sz w:val="20"/>
-          <w:szCs w:val="20"/>
-        </w:rPr>
-      </w:pPr>
-      <w:r>
-        <w:rPr>
-          <w:color w:val="000000"/>
-          <w:sz w:val="20"/>
-          <w:szCs w:val="20"/>
-        </w:rPr>
-        <w:t>Doctoral Candidate, UA Little Rock, Department of Information Science</w:t>
-      </w:r>
-    </w:p>
-    <w:p>
-      <w:pPr>
-        <w:widowControl/>
-        <w:pBdr>
-          <w:top w:val="nil"/>
-          <w:left w:val="nil"/>
-          <w:bottom w:val="nil"/>
-          <w:right w:val="nil"/>
-          <w:between w:val="nil"/>
-        </w:pBdr>
-        <w:spacing w:after="0"/>
-        <w:ind w:left="432"/>
-        <w:rPr>
-          <w:sz w:val="20"/>
-          <w:szCs w:val="20"/>
-        </w:rPr>
-      </w:pPr>
-      <w:hyperlink r:id="rId14">
-        <w:r>
-          <w:rPr>
-            <w:color w:val="1155CC"/>
-            <w:sz w:val="20"/>
-            <w:szCs w:val="20"/>
-            <w:u w:val="single"/>
-          </w:rPr>
-          <w:t>ecgrasby@ualr.edu</w:t>
-        </w:r>
-      </w:hyperlink>
-    </w:p>
-    <w:p>
-      <w:pPr>
-        <w:widowControl/>
-        <w:pBdr>
-          <w:top w:val="nil"/>
-          <w:left w:val="nil"/>
-          <w:bottom w:val="nil"/>
-          <w:right w:val="nil"/>
-          <w:between w:val="nil"/>
-        </w:pBdr>
-        <w:spacing w:after="0"/>
-        <w:ind w:left="432"/>
-        <w:rPr>
-          <w:sz w:val="20"/>
-          <w:szCs w:val="20"/>
-        </w:rPr>
-      </w:pPr>
-      <w:hyperlink r:id="rId15" w:history="1">
-        <w:r>
-          <w:rPr>
-            <w:rStyle w:val="Hyperlink"/>
-            <w:sz w:val="20"/>
-            <w:szCs w:val="20"/>
-          </w:rPr>
-          <w:t>https://linkedin.com/in/echarlesgrasby</w:t>
-        </w:r>
-      </w:hyperlink>
-    </w:p>
-    <w:p>
-      <w:pPr>
-        <w:widowControl/>
-        <w:pBdr>
-          <w:top w:val="nil"/>
-          <w:left w:val="nil"/>
-          <w:bottom w:val="nil"/>
-          <w:right w:val="nil"/>
-          <w:between w:val="nil"/>
-        </w:pBdr>
-        <w:spacing w:after="0"/>
-        <w:ind w:left="432"/>
-        <w:rPr>
-          <w:color w:val="000000"/>
-          <w:sz w:val="20"/>
-          <w:szCs w:val="20"/>
-        </w:rPr>
-      </w:pPr>
-    </w:p>
-    <w:p>
-      <w:pPr>
-        <w:widowControl/>
-        <w:pBdr>
-          <w:top w:val="nil"/>
-          <w:left w:val="nil"/>
-          <w:bottom w:val="nil"/>
-          <w:right w:val="nil"/>
-          <w:between w:val="nil"/>
-        </w:pBdr>
-        <w:spacing w:after="0"/>
-        <w:ind w:left="432"/>
-        <w:rPr>
-          <w:b/>
-          <w:bCs/>
-          <w:color w:val="000000"/>
-          <w:sz w:val="20"/>
-          <w:szCs w:val="20"/>
-        </w:rPr>
-      </w:pPr>
-      <w:r>
-        <w:rPr>
-          <w:b/>
-          <w:bCs/>
-          <w:color w:val="000000"/>
-          <w:sz w:val="20"/>
-          <w:szCs w:val="20"/>
-        </w:rPr>
-        <w:t>Dr. J. Daniel Berleant</w:t>
-      </w:r>
-    </w:p>
-    <w:p>
-      <w:pPr>
-        <w:widowControl/>
-        <w:pBdr>
-          <w:top w:val="nil"/>
-          <w:left w:val="nil"/>
-          <w:bottom w:val="nil"/>
-          <w:right w:val="nil"/>
-          <w:between w:val="nil"/>
-        </w:pBdr>
-        <w:spacing w:after="0"/>
-        <w:ind w:left="432"/>
-        <w:rPr>
-          <w:color w:val="000000"/>
-          <w:sz w:val="20"/>
-          <w:szCs w:val="20"/>
-        </w:rPr>
-      </w:pPr>
-      <w:r>
-        <w:rPr>
-          <w:color w:val="000000"/>
-          <w:sz w:val="20"/>
-          <w:szCs w:val="20"/>
-        </w:rPr>
-        <w:t>Professor, UA Little Rock, Department of Information Science</w:t>
-      </w:r>
-    </w:p>
-    <w:p>
-      <w:pPr>
-        <w:widowControl/>
-        <w:pBdr>
-          <w:top w:val="nil"/>
-          <w:left w:val="nil"/>
-          <w:bottom w:val="nil"/>
-          <w:right w:val="nil"/>
-          <w:between w:val="nil"/>
-        </w:pBdr>
-        <w:spacing w:after="0"/>
-        <w:ind w:left="432"/>
-      </w:pPr>
-      <w:hyperlink r:id="rId16">
-        <w:r>
-          <w:rPr>
-            <w:color w:val="1155CC"/>
-            <w:sz w:val="20"/>
-            <w:szCs w:val="20"/>
-            <w:u w:val="single"/>
-          </w:rPr>
-          <w:t>jdberleant@ualr.edu</w:t>
-        </w:r>
-      </w:hyperlink>
-    </w:p>
-    <w:p>
-      <w:pPr>
-        <w:widowControl/>
-        <w:pBdr>
-          <w:top w:val="nil"/>
-          <w:left w:val="nil"/>
-          <w:bottom w:val="nil"/>
-          <w:right w:val="nil"/>
-          <w:between w:val="nil"/>
-        </w:pBdr>
-        <w:spacing w:after="0"/>
-        <w:ind w:left="432"/>
-        <w:rPr>
-          <w:color w:val="000000"/>
-          <w:sz w:val="20"/>
-          <w:szCs w:val="20"/>
-        </w:rPr>
-      </w:pPr>
-      <w:hyperlink r:id="rId17" w:history="1">
-        <w:r>
-          <w:rPr>
-            <w:rStyle w:val="Hyperlink"/>
-            <w:sz w:val="20"/>
-            <w:szCs w:val="20"/>
-          </w:rPr>
-          <w:t>https://www.linkedin.com/in/daniel-berleant-4938451/</w:t>
-        </w:r>
-      </w:hyperlink>
-    </w:p>
-    <w:p>
-      <w:pPr>
-        <w:widowControl/>
-        <w:pBdr>
-          <w:top w:val="nil"/>
-          <w:left w:val="nil"/>
-          <w:bottom w:val="nil"/>
-          <w:right w:val="nil"/>
-          <w:between w:val="nil"/>
-        </w:pBdr>
-        <w:spacing w:after="0"/>
-        <w:rPr>
-          <w:color w:val="000000"/>
-          <w:sz w:val="20"/>
-          <w:szCs w:val="20"/>
-        </w:rPr>
-      </w:pPr>
-    </w:p>
-    <w:p>
-      <w:pPr>
-        <w:widowControl/>
-        <w:pBdr>
-          <w:top w:val="nil"/>
-          <w:left w:val="nil"/>
-          <w:bottom w:val="nil"/>
-          <w:right w:val="nil"/>
-          <w:between w:val="nil"/>
-        </w:pBdr>
-        <w:spacing w:after="0"/>
-        <w:rPr>
-          <w:color w:val="000000"/>
-          <w:sz w:val="20"/>
-          <w:szCs w:val="20"/>
-        </w:rPr>
-      </w:pPr>
-    </w:p>
-    <w:p>
-      <w:pPr>
-        <w:widowControl/>
-        <w:pBdr>
-          <w:top w:val="nil"/>
-          <w:left w:val="nil"/>
-          <w:bottom w:val="nil"/>
-          <w:right w:val="nil"/>
-          <w:between w:val="nil"/>
-        </w:pBdr>
-        <w:spacing w:after="0"/>
-        <w:rPr>
-          <w:color w:val="000000"/>
-          <w:sz w:val="20"/>
-          <w:szCs w:val="20"/>
-        </w:rPr>
-      </w:pPr>
-      <w:r>
-        <w:rPr>
-          <w:color w:val="000000"/>
-          <w:sz w:val="20"/>
-          <w:szCs w:val="20"/>
-        </w:rPr>
-        <w:t xml:space="preserve">SAS and all other SAS Institute Inc. product or service names are registered trademarks of SAS Institute Inc. in the USA and other countries. ® indicates USA registration. </w:t>
-      </w:r>
-    </w:p>
-    <w:p>
-      <w:pPr>
-        <w:widowControl/>
-        <w:pBdr>
-          <w:top w:val="nil"/>
-          <w:left w:val="nil"/>
-          <w:bottom w:val="nil"/>
-          <w:right w:val="nil"/>
-          <w:between w:val="nil"/>
-        </w:pBdr>
-        <w:spacing w:after="0"/>
-        <w:rPr>
-          <w:color w:val="000000"/>
-          <w:sz w:val="20"/>
-          <w:szCs w:val="20"/>
-        </w:rPr>
-      </w:pPr>
-    </w:p>
-    <w:p>
-      <w:pPr>
-        <w:widowControl/>
-        <w:pBdr>
-          <w:top w:val="nil"/>
-          <w:left w:val="nil"/>
-          <w:bottom w:val="nil"/>
-          <w:right w:val="nil"/>
-          <w:between w:val="nil"/>
-        </w:pBdr>
-        <w:spacing w:after="0"/>
-        <w:rPr>
-          <w:color w:val="000000"/>
-          <w:sz w:val="20"/>
-          <w:szCs w:val="20"/>
-        </w:rPr>
-      </w:pPr>
-      <w:r>
-        <w:rPr>
-          <w:color w:val="000000"/>
-          <w:sz w:val="20"/>
-          <w:szCs w:val="20"/>
-        </w:rPr>
-        <w:t xml:space="preserve">Other </w:t>
-      </w:r>
-      <w:proofErr w:type="gramStart"/>
-      <w:r>
-        <w:rPr>
-          <w:color w:val="000000"/>
-          <w:sz w:val="20"/>
-          <w:szCs w:val="20"/>
-        </w:rPr>
-        <w:t>brand</w:t>
-      </w:r>
-      <w:proofErr w:type="gramEnd"/>
-      <w:r>
-        <w:rPr>
-          <w:color w:val="000000"/>
-          <w:sz w:val="20"/>
-          <w:szCs w:val="20"/>
-        </w:rPr>
-        <w:t xml:space="preserve"> and product names are trademarks of their respective companies.</w:t>
-      </w:r>
-    </w:p>
-    <w:p>
-      <w:pPr>
-        <w:widowControl/>
-        <w:pBdr>
-          <w:top w:val="nil"/>
-          <w:left w:val="nil"/>
-          <w:bottom w:val="nil"/>
-          <w:right w:val="nil"/>
-          <w:between w:val="nil"/>
-        </w:pBdr>
-        <w:spacing w:after="0"/>
-        <w:ind w:left="432"/>
-        <w:rPr>
           <w:color w:val="000000"/>
           <w:sz w:val="20"/>
           <w:szCs w:val="20"/>
@@ -1785,9 +1529,9 @@
       <w:bookmarkEnd w:id="14"/>
     </w:p>
     <w:sectPr>
-      <w:footerReference w:type="even" r:id="rId18"/>
-      <w:footerReference w:type="default" r:id="rId19"/>
-      <w:footerReference w:type="first" r:id="rId20"/>
+      <w:footerReference w:type="even" r:id="rId19"/>
+      <w:footerReference w:type="default" r:id="rId20"/>
+      <w:footerReference w:type="first" r:id="rId21"/>
       <w:pgSz w:w="12240" w:h="15840"/>
       <w:pgMar w:top="1440" w:right="1440" w:bottom="1440" w:left="1440" w:header="720" w:footer="720" w:gutter="0"/>
       <w:pgNumType w:start="1"/>
@@ -1989,18 +1733,61 @@
       </w:pPr>
       <w:r>
         <w:rPr>
-          <w:rStyle w:val="FootnoteReference"/>
+          <w:sz w:val="18"/>
+          <w:szCs w:val="18"/>
+          <w:vertAlign w:val="superscript"/>
         </w:rPr>
         <w:footnoteRef/>
       </w:r>
       <w:r>
+        <w:rPr>
+          <w:sz w:val="18"/>
+          <w:szCs w:val="18"/>
+          <w:vertAlign w:val="superscript"/>
+        </w:rPr>
         <w:t xml:space="preserve"> </w:t>
       </w:r>
       <w:r>
         <w:rPr>
-          <w:lang w:val="en-US"/>
-        </w:rPr>
-        <w:t>The Energy Intermarket Surveillance Group (EISG) is the international, professional, conference of energy market monitors. Any given professional is a member of the EISG by virtue of working for an MMU that is an organizational member of the EISG.</w:t>
+          <w:sz w:val="18"/>
+          <w:szCs w:val="18"/>
+        </w:rPr>
+        <w:t>A Delphi study</w:t>
+      </w:r>
+      <w:r>
+        <w:rPr>
+          <w:sz w:val="18"/>
+          <w:szCs w:val="18"/>
+        </w:rPr>
+        <w:t xml:space="preserve"> “is a research survey technique used as a way of collecting data from respondents within their domain of expertise.” </w:t>
+      </w:r>
+      <w:r>
+        <w:rPr>
+          <w:sz w:val="18"/>
+          <w:szCs w:val="18"/>
+        </w:rPr>
+        <w:t xml:space="preserve">Put plainly, it is a panel of experts that anonymously respond to survey questions. A researcher then analyzes their results to arrive at a consensus that serves as the solution to a problem. </w:t>
+      </w:r>
+      <w:r>
+        <w:rPr>
+          <w:sz w:val="18"/>
+          <w:szCs w:val="18"/>
+        </w:rPr>
+        <w:t>[</w:t>
+      </w:r>
+      <w:r>
+        <w:rPr>
+          <w:sz w:val="18"/>
+          <w:szCs w:val="18"/>
+        </w:rPr>
+        <w:t>2</w:t>
+      </w:r>
+      <w:r>
+        <w:rPr>
+          <w:sz w:val="18"/>
+          <w:szCs w:val="18"/>
+        </w:rPr>
+        <w:t>]</w:t>
       </w:r>
     </w:p>
   </w:footnote>
@@ -2014,45 +1801,74 @@
       </w:pPr>
       <w:r>
         <w:rPr>
-          <w:rStyle w:val="FootnoteReference"/>
+          <w:sz w:val="18"/>
+          <w:szCs w:val="18"/>
+          <w:vertAlign w:val="superscript"/>
         </w:rPr>
         <w:footnoteRef/>
       </w:r>
       <w:r>
-        <w:t xml:space="preserve"> </w:t>
-      </w:r>
-      <w:r>
+        <w:rPr>
+          <w:sz w:val="18"/>
+          <w:szCs w:val="18"/>
+        </w:rPr>
+        <w:t xml:space="preserve"> The Energy Intermarket Surveillance Group (EISG) is the international, professional, conference of energy market monitors. Any given professional is a member of the EISG by virtue of working for an MMU that is an organizational member of the EISG.</w:t>
+      </w:r>
+    </w:p>
+  </w:footnote>
+  <w:footnote w:id="3">
+    <w:p>
+      <w:pPr>
+        <w:pStyle w:val="FootnoteText"/>
         <w:rPr>
           <w:lang w:val="en-US"/>
         </w:rPr>
-        <w:t xml:space="preserve">The research protocol for this Delphi study was approved by the UA Little Rock Institutional Review Board. The research protocol and copy of the waiver of informed consent can be found in </w:t>
+      </w:pPr>
+      <w:r>
+        <w:rPr>
+          <w:sz w:val="18"/>
+          <w:szCs w:val="18"/>
+          <w:vertAlign w:val="superscript"/>
+        </w:rPr>
+        <w:footnoteRef/>
+      </w:r>
+      <w:r>
+        <w:rPr>
+          <w:sz w:val="18"/>
+          <w:szCs w:val="18"/>
+        </w:rPr>
+        <w:t xml:space="preserve"> The research protocol for this Delphi study was approved by the UA Little Rock Institutional Review Board. The research protocol and copy of the waiver of informed consent can be found in </w:t>
       </w:r>
       <w:hyperlink r:id="rId1" w:history="1">
         <w:r>
           <w:rPr>
-            <w:rStyle w:val="Hyperlink"/>
-            <w:lang w:val="en-US"/>
+            <w:sz w:val="18"/>
+            <w:szCs w:val="18"/>
           </w:rPr>
           <w:t>this</w:t>
         </w:r>
       </w:hyperlink>
       <w:r>
         <w:rPr>
-          <w:lang w:val="en-US"/>
+          <w:sz w:val="18"/>
+          <w:szCs w:val="18"/>
         </w:rPr>
         <w:t xml:space="preserve"> GitHub repository: </w:t>
       </w:r>
       <w:hyperlink r:id="rId2" w:history="1">
         <w:r>
           <w:rPr>
-            <w:rStyle w:val="Hyperlink"/>
-            <w:i/>
-            <w:iCs/>
+            <w:sz w:val="18"/>
+            <w:szCs w:val="18"/>
           </w:rPr>
           <w:t>https://github.com/echarlesgrasby/dissertation/tree/master/ext</w:t>
         </w:r>
       </w:hyperlink>
       <w:r>
+        <w:rPr>
+          <w:sz w:val="18"/>
+          <w:szCs w:val="18"/>
+        </w:rPr>
         <w:t>.</w:t>
       </w:r>
     </w:p>
@@ -2348,6 +2164,204 @@
     </w:lvl>
   </w:abstractNum>
   <w:abstractNum w:abstractNumId="3" w15:restartNumberingAfterBreak="0">
+    <w:nsid w:val="15C83DB4"/>
+    <w:multiLevelType w:val="hybridMultilevel"/>
+    <w:tmpl w:val="378ECE44"/>
+    <w:lvl w:ilvl="0" w:tplc="7F1614C6">
+      <w:numFmt w:val="bullet"/>
+      <w:lvlText w:val=""/>
+      <w:lvlJc w:val="left"/>
+      <w:pPr>
+        <w:ind w:left="720" w:hanging="360"/>
+      </w:pPr>
+      <w:rPr>
+        <w:rFonts w:ascii="Symbol" w:eastAsia="Arial" w:hAnsi="Symbol" w:cs="Arial" w:hint="default"/>
+      </w:rPr>
+    </w:lvl>
+    <w:lvl w:ilvl="1" w:tplc="04090003">
+      <w:start w:val="1"/>
+      <w:numFmt w:val="bullet"/>
+      <w:lvlText w:val="o"/>
+      <w:lvlJc w:val="left"/>
+      <w:pPr>
+        <w:ind w:left="1440" w:hanging="360"/>
+      </w:pPr>
+      <w:rPr>
+        <w:rFonts w:ascii="Courier New" w:hAnsi="Courier New" w:cs="Courier New" w:hint="default"/>
+      </w:rPr>
+    </w:lvl>
+    <w:lvl w:ilvl="2" w:tplc="04090005" w:tentative="1">
+      <w:start w:val="1"/>
+      <w:numFmt w:val="bullet"/>
+      <w:lvlText w:val=""/>
+      <w:lvlJc w:val="left"/>
+      <w:pPr>
+        <w:ind w:left="2160" w:hanging="360"/>
+      </w:pPr>
+      <w:rPr>
+        <w:rFonts w:ascii="Wingdings" w:hAnsi="Wingdings" w:hint="default"/>
+      </w:rPr>
+    </w:lvl>
+    <w:lvl w:ilvl="3" w:tplc="04090001" w:tentative="1">
+      <w:start w:val="1"/>
+      <w:numFmt w:val="bullet"/>
+      <w:lvlText w:val=""/>
+      <w:lvlJc w:val="left"/>
+      <w:pPr>
+        <w:ind w:left="2880" w:hanging="360"/>
+      </w:pPr>
+      <w:rPr>
+        <w:rFonts w:ascii="Symbol" w:hAnsi="Symbol" w:hint="default"/>
+      </w:rPr>
+    </w:lvl>
+    <w:lvl w:ilvl="4" w:tplc="04090003" w:tentative="1">
+      <w:start w:val="1"/>
+      <w:numFmt w:val="bullet"/>
+      <w:lvlText w:val="o"/>
+      <w:lvlJc w:val="left"/>
+      <w:pPr>
+        <w:ind w:left="3600" w:hanging="360"/>
+      </w:pPr>
+      <w:rPr>
+        <w:rFonts w:ascii="Courier New" w:hAnsi="Courier New" w:cs="Courier New" w:hint="default"/>
+      </w:rPr>
+    </w:lvl>
+    <w:lvl w:ilvl="5" w:tplc="04090005" w:tentative="1">
+      <w:start w:val="1"/>
+      <w:numFmt w:val="bullet"/>
+      <w:lvlText w:val=""/>
+      <w:lvlJc w:val="left"/>
+      <w:pPr>
+        <w:ind w:left="4320" w:hanging="360"/>
+      </w:pPr>
+      <w:rPr>
+        <w:rFonts w:ascii="Wingdings" w:hAnsi="Wingdings" w:hint="default"/>
+      </w:rPr>
+    </w:lvl>
+    <w:lvl w:ilvl="6" w:tplc="04090001" w:tentative="1">
+      <w:start w:val="1"/>
+      <w:numFmt w:val="bullet"/>
+      <w:lvlText w:val=""/>
+      <w:lvlJc w:val="left"/>
+      <w:pPr>
+        <w:ind w:left="5040" w:hanging="360"/>
+      </w:pPr>
+      <w:rPr>
+        <w:rFonts w:ascii="Symbol" w:hAnsi="Symbol" w:hint="default"/>
+      </w:rPr>
+    </w:lvl>
+    <w:lvl w:ilvl="7" w:tplc="04090003" w:tentative="1">
+      <w:start w:val="1"/>
+      <w:numFmt w:val="bullet"/>
+      <w:lvlText w:val="o"/>
+      <w:lvlJc w:val="left"/>
+      <w:pPr>
+        <w:ind w:left="5760" w:hanging="360"/>
+      </w:pPr>
+      <w:rPr>
+        <w:rFonts w:ascii="Courier New" w:hAnsi="Courier New" w:cs="Courier New" w:hint="default"/>
+      </w:rPr>
+    </w:lvl>
+    <w:lvl w:ilvl="8" w:tplc="04090005" w:tentative="1">
+      <w:start w:val="1"/>
+      <w:numFmt w:val="bullet"/>
+      <w:lvlText w:val=""/>
+      <w:lvlJc w:val="left"/>
+      <w:pPr>
+        <w:ind w:left="6480" w:hanging="360"/>
+      </w:pPr>
+      <w:rPr>
+        <w:rFonts w:ascii="Wingdings" w:hAnsi="Wingdings" w:hint="default"/>
+      </w:rPr>
+    </w:lvl>
+  </w:abstractNum>
+  <w:abstractNum w:abstractNumId="4" w15:restartNumberingAfterBreak="0">
+    <w:nsid w:val="188B48AC"/>
+    <w:multiLevelType w:val="hybridMultilevel"/>
+    <w:tmpl w:val="56CAEB48"/>
+    <w:lvl w:ilvl="0" w:tplc="0409000F">
+      <w:start w:val="1"/>
+      <w:numFmt w:val="decimal"/>
+      <w:lvlText w:val="%1."/>
+      <w:lvlJc w:val="left"/>
+      <w:pPr>
+        <w:ind w:left="720" w:hanging="360"/>
+      </w:pPr>
+    </w:lvl>
+    <w:lvl w:ilvl="1" w:tplc="04090019" w:tentative="1">
+      <w:start w:val="1"/>
+      <w:numFmt w:val="lowerLetter"/>
+      <w:lvlText w:val="%2."/>
+      <w:lvlJc w:val="left"/>
+      <w:pPr>
+        <w:ind w:left="1440" w:hanging="360"/>
+      </w:pPr>
+    </w:lvl>
+    <w:lvl w:ilvl="2" w:tplc="0409001B" w:tentative="1">
+      <w:start w:val="1"/>
+      <w:numFmt w:val="lowerRoman"/>
+      <w:lvlText w:val="%3."/>
+      <w:lvlJc w:val="right"/>
+      <w:pPr>
+        <w:ind w:left="2160" w:hanging="180"/>
+      </w:pPr>
+    </w:lvl>
+    <w:lvl w:ilvl="3" w:tplc="0409000F" w:tentative="1">
+      <w:start w:val="1"/>
+      <w:numFmt w:val="decimal"/>
+      <w:lvlText w:val="%4."/>
+      <w:lvlJc w:val="left"/>
+      <w:pPr>
+        <w:ind w:left="2880" w:hanging="360"/>
+      </w:pPr>
+    </w:lvl>
+    <w:lvl w:ilvl="4" w:tplc="04090019" w:tentative="1">
+      <w:start w:val="1"/>
+      <w:numFmt w:val="lowerLetter"/>
+      <w:lvlText w:val="%5."/>
+      <w:lvlJc w:val="left"/>
+      <w:pPr>
+        <w:ind w:left="3600" w:hanging="360"/>
+      </w:pPr>
+    </w:lvl>
+    <w:lvl w:ilvl="5" w:tplc="0409001B" w:tentative="1">
+      <w:start w:val="1"/>
+      <w:numFmt w:val="lowerRoman"/>
+      <w:lvlText w:val="%6."/>
+      <w:lvlJc w:val="right"/>
+      <w:pPr>
+        <w:ind w:left="4320" w:hanging="180"/>
+      </w:pPr>
+    </w:lvl>
+    <w:lvl w:ilvl="6" w:tplc="0409000F" w:tentative="1">
+      <w:start w:val="1"/>
+      <w:numFmt w:val="decimal"/>
+      <w:lvlText w:val="%7."/>
+      <w:lvlJc w:val="left"/>
+      <w:pPr>
+        <w:ind w:left="5040" w:hanging="360"/>
+      </w:pPr>
+    </w:lvl>
+    <w:lvl w:ilvl="7" w:tplc="04090019" w:tentative="1">
+      <w:start w:val="1"/>
+      <w:numFmt w:val="lowerLetter"/>
+      <w:lvlText w:val="%8."/>
+      <w:lvlJc w:val="left"/>
+      <w:pPr>
+        <w:ind w:left="5760" w:hanging="360"/>
+      </w:pPr>
+    </w:lvl>
+    <w:lvl w:ilvl="8" w:tplc="0409001B" w:tentative="1">
+      <w:start w:val="1"/>
+      <w:numFmt w:val="lowerRoman"/>
+      <w:lvlText w:val="%9."/>
+      <w:lvlJc w:val="right"/>
+      <w:pPr>
+        <w:ind w:left="6480" w:hanging="180"/>
+      </w:pPr>
+    </w:lvl>
+  </w:abstractNum>
+  <w:abstractNum w:abstractNumId="5" w15:restartNumberingAfterBreak="0">
     <w:nsid w:val="273C521C"/>
     <w:multiLevelType w:val="multilevel"/>
     <w:tmpl w:val="8E70D592"/>
@@ -2460,7 +2474,7 @@
       </w:rPr>
     </w:lvl>
   </w:abstractNum>
-  <w:abstractNum w:abstractNumId="4" w15:restartNumberingAfterBreak="0">
+  <w:abstractNum w:abstractNumId="6" w15:restartNumberingAfterBreak="0">
     <w:nsid w:val="36B742F8"/>
     <w:multiLevelType w:val="multilevel"/>
     <w:tmpl w:val="BF546CEA"/>
@@ -2546,7 +2560,7 @@
       </w:pPr>
     </w:lvl>
   </w:abstractNum>
-  <w:abstractNum w:abstractNumId="5" w15:restartNumberingAfterBreak="0">
+  <w:abstractNum w:abstractNumId="7" w15:restartNumberingAfterBreak="0">
     <w:nsid w:val="371C70B9"/>
     <w:multiLevelType w:val="multilevel"/>
     <w:tmpl w:val="97E016F6"/>
@@ -2659,7 +2673,7 @@
       </w:rPr>
     </w:lvl>
   </w:abstractNum>
-  <w:abstractNum w:abstractNumId="6" w15:restartNumberingAfterBreak="0">
+  <w:abstractNum w:abstractNumId="8" w15:restartNumberingAfterBreak="0">
     <w:nsid w:val="4FDC7F55"/>
     <w:multiLevelType w:val="multilevel"/>
     <w:tmpl w:val="7730D756"/>
@@ -2772,7 +2786,7 @@
       </w:rPr>
     </w:lvl>
   </w:abstractNum>
-  <w:abstractNum w:abstractNumId="7" w15:restartNumberingAfterBreak="0">
+  <w:abstractNum w:abstractNumId="9" w15:restartNumberingAfterBreak="0">
     <w:nsid w:val="57826104"/>
     <w:multiLevelType w:val="hybridMultilevel"/>
     <w:tmpl w:val="A10CB68A"/>
@@ -2861,7 +2875,7 @@
       </w:pPr>
     </w:lvl>
   </w:abstractNum>
-  <w:abstractNum w:abstractNumId="8" w15:restartNumberingAfterBreak="0">
+  <w:abstractNum w:abstractNumId="10" w15:restartNumberingAfterBreak="0">
     <w:nsid w:val="61624546"/>
     <w:multiLevelType w:val="multilevel"/>
     <w:tmpl w:val="81B0DB68"/>
@@ -2947,7 +2961,7 @@
       </w:pPr>
     </w:lvl>
   </w:abstractNum>
-  <w:abstractNum w:abstractNumId="9" w15:restartNumberingAfterBreak="0">
+  <w:abstractNum w:abstractNumId="11" w15:restartNumberingAfterBreak="0">
     <w:nsid w:val="64D625FB"/>
     <w:multiLevelType w:val="multilevel"/>
     <w:tmpl w:val="F4921BF8"/>
@@ -3036,7 +3050,7 @@
       </w:pPr>
     </w:lvl>
   </w:abstractNum>
-  <w:abstractNum w:abstractNumId="10" w15:restartNumberingAfterBreak="0">
+  <w:abstractNum w:abstractNumId="12" w15:restartNumberingAfterBreak="0">
     <w:nsid w:val="6B003515"/>
     <w:multiLevelType w:val="multilevel"/>
     <w:tmpl w:val="664E2600"/>
@@ -3122,7 +3136,7 @@
       </w:pPr>
     </w:lvl>
   </w:abstractNum>
-  <w:abstractNum w:abstractNumId="11" w15:restartNumberingAfterBreak="0">
+  <w:abstractNum w:abstractNumId="13" w15:restartNumberingAfterBreak="0">
     <w:nsid w:val="764E4CF0"/>
     <w:multiLevelType w:val="hybridMultilevel"/>
     <w:tmpl w:val="D4EE5A78"/>
@@ -3236,40 +3250,46 @@
     </w:lvl>
   </w:abstractNum>
   <w:num w:numId="1" w16cid:durableId="1323659480">
-    <w:abstractNumId w:val="9"/>
+    <w:abstractNumId w:val="11"/>
   </w:num>
   <w:num w:numId="2" w16cid:durableId="1403943416">
-    <w:abstractNumId w:val="8"/>
+    <w:abstractNumId w:val="10"/>
   </w:num>
   <w:num w:numId="3" w16cid:durableId="1773236115">
-    <w:abstractNumId w:val="10"/>
+    <w:abstractNumId w:val="12"/>
   </w:num>
   <w:num w:numId="4" w16cid:durableId="1238704721">
     <w:abstractNumId w:val="0"/>
   </w:num>
   <w:num w:numId="5" w16cid:durableId="1941133572">
-    <w:abstractNumId w:val="4"/>
+    <w:abstractNumId w:val="6"/>
   </w:num>
   <w:num w:numId="6" w16cid:durableId="455293798">
-    <w:abstractNumId w:val="3"/>
+    <w:abstractNumId w:val="5"/>
   </w:num>
   <w:num w:numId="7" w16cid:durableId="351998595">
     <w:abstractNumId w:val="1"/>
   </w:num>
   <w:num w:numId="8" w16cid:durableId="28146458">
-    <w:abstractNumId w:val="6"/>
+    <w:abstractNumId w:val="8"/>
   </w:num>
   <w:num w:numId="9" w16cid:durableId="1734307518">
-    <w:abstractNumId w:val="5"/>
+    <w:abstractNumId w:val="7"/>
   </w:num>
   <w:num w:numId="10" w16cid:durableId="1317219074">
-    <w:abstractNumId w:val="11"/>
+    <w:abstractNumId w:val="13"/>
   </w:num>
   <w:num w:numId="11" w16cid:durableId="388695762">
-    <w:abstractNumId w:val="7"/>
+    <w:abstractNumId w:val="9"/>
   </w:num>
   <w:num w:numId="12" w16cid:durableId="385569504">
     <w:abstractNumId w:val="2"/>
+  </w:num>
+  <w:num w:numId="13" w16cid:durableId="511409727">
+    <w:abstractNumId w:val="4"/>
+  </w:num>
+  <w:num w:numId="14" w16cid:durableId="682245822">
+    <w:abstractNumId w:val="3"/>
   </w:num>
 </w:numbering>
 </file>
@@ -3797,7 +3817,6 @@
   <w:style w:type="character" w:default="1" w:styleId="DefaultParagraphFont">
     <w:name w:val="Default Paragraph Font"/>
     <w:uiPriority w:val="1"/>
-    <w:semiHidden/>
     <w:unhideWhenUsed/>
   </w:style>
   <w:style w:type="table" w:default="1" w:styleId="TableNormal">

</xml_diff>

<commit_message>
Additional work on rough draft
</commit_message>
<xml_diff>
--- a/DSL_SEASUG-2026_Paper_Draft1.docx
+++ b/DSL_SEASUG-2026_Paper_Draft1.docx
@@ -30,7 +30,29 @@
           <w:sz w:val="20"/>
           <w:szCs w:val="20"/>
         </w:rPr>
-        <w:t>SEASUG Paper ###-2026</w:t>
+        <w:t xml:space="preserve">SEASUG </w:t>
+      </w:r>
+      <w:proofErr w:type="gramStart"/>
+      <w:r>
+        <w:rPr>
+          <w:b/>
+          <w:bCs/>
+          <w:color w:val="000000"/>
+          <w:sz w:val="20"/>
+          <w:szCs w:val="20"/>
+        </w:rPr>
+        <w:t>Paper ###-</w:t>
+      </w:r>
+      <w:proofErr w:type="gramEnd"/>
+      <w:r>
+        <w:rPr>
+          <w:b/>
+          <w:bCs/>
+          <w:color w:val="000000"/>
+          <w:sz w:val="20"/>
+          <w:szCs w:val="20"/>
+        </w:rPr>
+        <w:t>2026</w:t>
       </w:r>
     </w:p>
     <w:p>
@@ -61,7 +83,29 @@
           <w:sz w:val="26"/>
           <w:szCs w:val="26"/>
         </w:rPr>
-        <w:t>A Domain-Specific Computer Language for Market Monitoring: the Missing Link Between Thoughts and SAS®</w:t>
+        <w:t xml:space="preserve">A Domain-Specific Computer Language for Market Monitoring: </w:t>
+      </w:r>
+      <w:proofErr w:type="gramStart"/>
+      <w:r>
+        <w:rPr>
+          <w:b/>
+          <w:bCs/>
+          <w:color w:val="000000"/>
+          <w:sz w:val="26"/>
+          <w:szCs w:val="26"/>
+        </w:rPr>
+        <w:t>the</w:t>
+      </w:r>
+      <w:proofErr w:type="gramEnd"/>
+      <w:r>
+        <w:rPr>
+          <w:b/>
+          <w:bCs/>
+          <w:color w:val="000000"/>
+          <w:sz w:val="26"/>
+          <w:szCs w:val="26"/>
+        </w:rPr>
+        <w:t xml:space="preserve"> Missing Link Between Thoughts and SAS®</w:t>
       </w:r>
     </w:p>
     <w:p>
@@ -106,7 +150,7 @@
         <w:pStyle w:val="Heading1"/>
       </w:pPr>
       <w:r>
-        <w:t xml:space="preserve">Abstract </w:t>
+        <w:t>ABSTRACT</w:t>
       </w:r>
     </w:p>
     <w:p>
@@ -128,6 +172,30 @@
     <w:p>
       <w:r>
         <w:t>This paper, additionally, demonstrates the flexibility of this proposed design by providing example scripts that satisfy several use cases of this system. These use cases were identified by an anonymous panel of market monitors as part of a Delphi study.</w:t>
+      </w:r>
+    </w:p>
+    <w:p>
+      <w:pPr>
+        <w:rPr>
+          <w:i/>
+          <w:iCs/>
+        </w:rPr>
+      </w:pPr>
+      <w:r>
+        <w:rPr>
+          <w:b/>
+          <w:bCs/>
+          <w:i/>
+          <w:iCs/>
+        </w:rPr>
+        <w:t>Keywords</w:t>
+      </w:r>
+      <w:r>
+        <w:rPr>
+          <w:i/>
+          <w:iCs/>
+        </w:rPr>
+        <w:t>: domain-specific language, analyst abstraction, energy market, market monitoring, transpiler</w:t>
       </w:r>
     </w:p>
     <w:p>
@@ -137,7 +205,7 @@
       <w:bookmarkStart w:id="0" w:name="_heading=h.m8l0puddzh9t" w:colFirst="0" w:colLast="0"/>
       <w:bookmarkEnd w:id="0"/>
       <w:r>
-        <w:t xml:space="preserve">Introduction </w:t>
+        <w:t>INTRODUCTION</w:t>
       </w:r>
     </w:p>
     <w:p>
@@ -154,6 +222,14 @@
       </w:pPr>
       <w:r>
         <w:t>Statement of contributions</w:t>
+      </w:r>
+    </w:p>
+    <w:p>
+      <w:pPr>
+        <w:pStyle w:val="Heading3"/>
+      </w:pPr>
+      <w:r>
+        <w:t>Energy market structure and monitoring</w:t>
       </w:r>
     </w:p>
     <w:p>
@@ -163,7 +239,7 @@
       <w:bookmarkStart w:id="1" w:name="_heading=h.y2zz5yuofigo" w:colFirst="0" w:colLast="0"/>
       <w:bookmarkEnd w:id="1"/>
       <w:r>
-        <w:t>Background</w:t>
+        <w:t>BACKGROUND</w:t>
       </w:r>
     </w:p>
     <w:p>
@@ -173,13 +249,89 @@
       <w:bookmarkStart w:id="2" w:name="_heading=h.wc0ucybh4nlh" w:colFirst="0" w:colLast="0"/>
       <w:bookmarkEnd w:id="2"/>
       <w:r>
-        <w:t xml:space="preserve">Energy </w:t>
-      </w:r>
-      <w:r>
-        <w:t>ma</w:t>
-      </w:r>
-      <w:r>
-        <w:t>rket structure and monitoring</w:t>
+        <w:t xml:space="preserve">The business problem: why a </w:t>
+      </w:r>
+      <w:r>
+        <w:t>d</w:t>
+      </w:r>
+      <w:r>
+        <w:t>omain-</w:t>
+      </w:r>
+      <w:r>
+        <w:t>s</w:t>
+      </w:r>
+      <w:r>
+        <w:t xml:space="preserve">pecific </w:t>
+      </w:r>
+      <w:r>
+        <w:t>l</w:t>
+      </w:r>
+      <w:r>
+        <w:t>anguage?</w:t>
+      </w:r>
+    </w:p>
+    <w:p>
+      <w:r>
+        <w:t xml:space="preserve">Systems such as SAS already provide an abstraction layer for data processing – why propose to build a DSL on top of SAS at all? The answer to this question lies in the energy data landscape itself. Although the BES is operationally complex, the surrounding data infrastructure is even more fragmented. Market monitors routinely interact with disparate systems, siloed databases, undocumented schemas, and numerous other information quality issues that impede their analysis. </w:t>
+      </w:r>
+    </w:p>
+    <w:p>
+      <w:r>
+        <w:t xml:space="preserve">Many of these issues are </w:t>
+      </w:r>
+      <w:r>
+        <w:rPr>
+          <w:i/>
+          <w:iCs/>
+        </w:rPr>
+        <w:t>semantic problems</w:t>
+      </w:r>
+      <w:r>
+        <w:t xml:space="preserve">, requiring an individual to encode their domain expertise into SAS or SQL scripts. A prevalent example in energy markets involves how timestamps are interpreted across time zones. Because energy market transactions span across time zones, timestamps on these transactions may be recorded in local time, adjacent market time, or Coordinated Universal Time (UTC/GMT). If the time zone metadata is not readily apparent, analytical queries may produce </w:t>
+      </w:r>
+      <w:r>
+        <w:rPr>
+          <w:i/>
+          <w:iCs/>
+        </w:rPr>
+        <w:t>fundamentally incorrect results</w:t>
+      </w:r>
+      <w:r>
+        <w:t xml:space="preserve">, despite being written as </w:t>
+      </w:r>
+      <w:r>
+        <w:rPr>
+          <w:i/>
+          <w:iCs/>
+        </w:rPr>
+        <w:t>syntactically valid</w:t>
+      </w:r>
+      <w:r>
+        <w:t>.</w:t>
+      </w:r>
+    </w:p>
+    <w:p>
+      <w:r>
+        <w:t xml:space="preserve">Modern analytics platforms provide mechanisms for performing these conversions, but they tend to rely on the user understanding and correctly applying the domain-level semantics associated with the data (using the appropriate time zone, for example). By leveraging metadata and domain-aware rules, </w:t>
+      </w:r>
+      <w:proofErr w:type="gramStart"/>
+      <w:r>
+        <w:t>the DSL</w:t>
+      </w:r>
+      <w:proofErr w:type="gramEnd"/>
+      <w:r>
+        <w:t xml:space="preserve"> can transparently handle these operations without requiring the user to manually account for such details.</w:t>
+      </w:r>
+    </w:p>
+    <w:p>
+      <w:r>
+        <w:t xml:space="preserve">The proposed DSL is not intended to replace existing analytics platforms, like SAS, but instead </w:t>
+      </w:r>
+      <w:r>
+        <w:t>provides</w:t>
+      </w:r>
+      <w:r>
+        <w:t xml:space="preserve"> a semantic layer that mitigates these information quality risks.</w:t>
       </w:r>
     </w:p>
     <w:p>
@@ -187,32 +339,6 @@
         <w:pStyle w:val="Heading3"/>
       </w:pPr>
       <w:r>
-        <w:t xml:space="preserve">The business problem: why a </w:t>
-      </w:r>
-      <w:r>
-        <w:t>d</w:t>
-      </w:r>
-      <w:r>
-        <w:t>omain-</w:t>
-      </w:r>
-      <w:r>
-        <w:t>s</w:t>
-      </w:r>
-      <w:r>
-        <w:t xml:space="preserve">pecific </w:t>
-      </w:r>
-      <w:r>
-        <w:t>l</w:t>
-      </w:r>
-      <w:r>
-        <w:t>anguage?</w:t>
-      </w:r>
-    </w:p>
-    <w:p>
-      <w:pPr>
-        <w:pStyle w:val="Heading3"/>
-      </w:pPr>
-      <w:r>
         <w:t>Why SAS</w:t>
       </w:r>
       <w:r>
@@ -242,7 +368,11 @@
         <w:t xml:space="preserve"> the</w:t>
       </w:r>
       <w:r>
-        <w:t xml:space="preserve"> execution of the language, there are other components that are required to provide users with a functional analysis system. These main components include a data processing engine, a reliable data typing scheme, and ca</w:t>
+        <w:t xml:space="preserve"> execution of the language, there are other components that are required to provide users with a functional analysis system. These main components include a </w:t>
+      </w:r>
+      <w:r>
+        <w:lastRenderedPageBreak/>
+        <w:t>data processing engine, a reliable data typing scheme, and ca</w:t>
       </w:r>
       <w:r>
         <w:t>p</w:t>
@@ -319,9 +449,11 @@
       <w:r>
         <w:t xml:space="preserve">With each of these infrastructural components available within one platform, </w:t>
       </w:r>
+      <w:proofErr w:type="gramStart"/>
       <w:r>
         <w:t>the DSL</w:t>
       </w:r>
+      <w:proofErr w:type="gramEnd"/>
       <w:r>
         <w:t xml:space="preserve"> can remain focused on allowing the user to write intuitive data logic. The DSL can then offload any technical complexity to SAS and return results and error messages back to the user.</w:t>
       </w:r>
@@ -331,21 +463,12 @@
         <w:pStyle w:val="Heading1"/>
       </w:pPr>
       <w:r>
-        <w:t>Requirements Solicitation</w:t>
-      </w:r>
-    </w:p>
-    <w:p>
-      <w:pPr>
-        <w:pStyle w:val="Heading3"/>
-      </w:pPr>
+        <w:t>REQUIREMENTS SOLICITATION</w:t>
+      </w:r>
+    </w:p>
+    <w:p>
       <w:bookmarkStart w:id="3" w:name="_heading=h.v04ytp5vmndc" w:colFirst="0" w:colLast="0"/>
       <w:bookmarkEnd w:id="3"/>
-      <w:r>
-        <w:lastRenderedPageBreak/>
-        <w:t>Delphi study methodology</w:t>
-      </w:r>
-    </w:p>
-    <w:p>
       <w:r>
         <w:t>To identify relevant use cases during the implementation of this DSL, the researchers chose to proctor a Delphi study</w:t>
       </w:r>
@@ -428,39 +551,608 @@
         <w:fldChar w:fldCharType="begin"/>
       </w:r>
       <w:r>
-        <w:instrText xml:space="preserve"> REF _Ref230708375 \h </w:instrText>
-      </w:r>
-      <w:r>
-        <w:instrText xml:space="preserve"> \* MERGEFORMAT </w:instrText>
+        <w:instrText xml:space="preserve"> REF _Ref230939531 \h </w:instrText>
       </w:r>
       <w:r>
         <w:fldChar w:fldCharType="separate"/>
       </w:r>
       <w:r>
-        <w:t>Figure 1</w:t>
+        <w:t xml:space="preserve">Table </w:t>
+      </w:r>
+      <w:r>
+        <w:rPr>
+          <w:noProof/>
+        </w:rPr>
+        <w:t>1</w:t>
       </w:r>
       <w:r>
         <w:fldChar w:fldCharType="end"/>
       </w:r>
       <w:r>
-        <w:t xml:space="preserve"> professional role mix of the panelists, indicating that market monitoring analysts make up the largest portion of the panelists, with a mix of other roles including management, economists, data scientists, and a developer.</w:t>
+        <w:t xml:space="preserve"> displays the </w:t>
+      </w:r>
+      <w:r>
+        <w:t>professional role mix of the panelists, indicating that market monitoring analysts make up the largest portion of the panelists, with a mix of other roles including management, economists, data scientists, and a developer.</w:t>
+      </w:r>
+    </w:p>
+    <w:tbl>
+      <w:tblPr>
+        <w:tblStyle w:val="TableGrid"/>
+        <w:tblW w:w="0" w:type="auto"/>
+        <w:jc w:val="center"/>
+        <w:tblLook w:val="04A0" w:firstRow="1" w:lastRow="0" w:firstColumn="1" w:lastColumn="0" w:noHBand="0" w:noVBand="1"/>
+      </w:tblPr>
+      <w:tblGrid>
+        <w:gridCol w:w="2337"/>
+        <w:gridCol w:w="2337"/>
+        <w:gridCol w:w="2337"/>
+      </w:tblGrid>
+      <w:tr>
+        <w:trPr>
+          <w:jc w:val="center"/>
+        </w:trPr>
+        <w:tc>
+          <w:tcPr>
+            <w:tcW w:w="2337" w:type="dxa"/>
+          </w:tcPr>
+          <w:p>
+            <w:pPr>
+              <w:jc w:val="center"/>
+              <w:rPr>
+                <w:b/>
+                <w:bCs/>
+              </w:rPr>
+            </w:pPr>
+            <w:r>
+              <w:rPr>
+                <w:b/>
+                <w:bCs/>
+              </w:rPr>
+              <w:t>Role</w:t>
+            </w:r>
+          </w:p>
+        </w:tc>
+        <w:tc>
+          <w:tcPr>
+            <w:tcW w:w="2337" w:type="dxa"/>
+          </w:tcPr>
+          <w:p>
+            <w:pPr>
+              <w:jc w:val="center"/>
+              <w:rPr>
+                <w:b/>
+                <w:bCs/>
+              </w:rPr>
+            </w:pPr>
+            <w:r>
+              <w:rPr>
+                <w:b/>
+                <w:bCs/>
+              </w:rPr>
+              <w:t>Count of Role in Panel</w:t>
+            </w:r>
+          </w:p>
+        </w:tc>
+        <w:tc>
+          <w:tcPr>
+            <w:tcW w:w="2337" w:type="dxa"/>
+          </w:tcPr>
+          <w:p>
+            <w:pPr>
+              <w:jc w:val="center"/>
+              <w:rPr>
+                <w:b/>
+                <w:bCs/>
+              </w:rPr>
+            </w:pPr>
+            <w:r>
+              <w:rPr>
+                <w:b/>
+                <w:bCs/>
+              </w:rPr>
+              <w:t>Percentage (%)</w:t>
+            </w:r>
+          </w:p>
+        </w:tc>
+      </w:tr>
+      <w:tr>
+        <w:trPr>
+          <w:jc w:val="center"/>
+        </w:trPr>
+        <w:tc>
+          <w:tcPr>
+            <w:tcW w:w="2337" w:type="dxa"/>
+          </w:tcPr>
+          <w:p>
+            <w:pPr>
+              <w:jc w:val="center"/>
+            </w:pPr>
+            <w:r>
+              <w:t>Market Monitor (Analyst)</w:t>
+            </w:r>
+          </w:p>
+        </w:tc>
+        <w:tc>
+          <w:tcPr>
+            <w:tcW w:w="2337" w:type="dxa"/>
+          </w:tcPr>
+          <w:p>
+            <w:pPr>
+              <w:jc w:val="center"/>
+            </w:pPr>
+            <w:r>
+              <w:t>13</w:t>
+            </w:r>
+          </w:p>
+        </w:tc>
+        <w:tc>
+          <w:tcPr>
+            <w:tcW w:w="2337" w:type="dxa"/>
+          </w:tcPr>
+          <w:p>
+            <w:pPr>
+              <w:jc w:val="center"/>
+            </w:pPr>
+            <w:r>
+              <w:t>68%</w:t>
+            </w:r>
+          </w:p>
+        </w:tc>
+      </w:tr>
+      <w:tr>
+        <w:trPr>
+          <w:jc w:val="center"/>
+        </w:trPr>
+        <w:tc>
+          <w:tcPr>
+            <w:tcW w:w="2337" w:type="dxa"/>
+          </w:tcPr>
+          <w:p>
+            <w:pPr>
+              <w:jc w:val="center"/>
+            </w:pPr>
+            <w:r>
+              <w:t>Management</w:t>
+            </w:r>
+          </w:p>
+        </w:tc>
+        <w:tc>
+          <w:tcPr>
+            <w:tcW w:w="2337" w:type="dxa"/>
+          </w:tcPr>
+          <w:p>
+            <w:pPr>
+              <w:jc w:val="center"/>
+            </w:pPr>
+            <w:r>
+              <w:t>4</w:t>
+            </w:r>
+          </w:p>
+        </w:tc>
+        <w:tc>
+          <w:tcPr>
+            <w:tcW w:w="2337" w:type="dxa"/>
+          </w:tcPr>
+          <w:p>
+            <w:pPr>
+              <w:jc w:val="center"/>
+            </w:pPr>
+            <w:r>
+              <w:t>21%</w:t>
+            </w:r>
+          </w:p>
+        </w:tc>
+      </w:tr>
+      <w:tr>
+        <w:trPr>
+          <w:jc w:val="center"/>
+        </w:trPr>
+        <w:tc>
+          <w:tcPr>
+            <w:tcW w:w="2337" w:type="dxa"/>
+          </w:tcPr>
+          <w:p>
+            <w:pPr>
+              <w:jc w:val="center"/>
+            </w:pPr>
+            <w:r>
+              <w:t>Economist</w:t>
+            </w:r>
+          </w:p>
+        </w:tc>
+        <w:tc>
+          <w:tcPr>
+            <w:tcW w:w="2337" w:type="dxa"/>
+          </w:tcPr>
+          <w:p>
+            <w:pPr>
+              <w:jc w:val="center"/>
+            </w:pPr>
+            <w:r>
+              <w:t>3</w:t>
+            </w:r>
+          </w:p>
+        </w:tc>
+        <w:tc>
+          <w:tcPr>
+            <w:tcW w:w="2337" w:type="dxa"/>
+          </w:tcPr>
+          <w:p>
+            <w:pPr>
+              <w:jc w:val="center"/>
+            </w:pPr>
+            <w:r>
+              <w:t>16%</w:t>
+            </w:r>
+          </w:p>
+        </w:tc>
+      </w:tr>
+      <w:tr>
+        <w:trPr>
+          <w:jc w:val="center"/>
+        </w:trPr>
+        <w:tc>
+          <w:tcPr>
+            <w:tcW w:w="2337" w:type="dxa"/>
+          </w:tcPr>
+          <w:p>
+            <w:pPr>
+              <w:jc w:val="center"/>
+            </w:pPr>
+            <w:r>
+              <w:t>Data Scientist</w:t>
+            </w:r>
+          </w:p>
+        </w:tc>
+        <w:tc>
+          <w:tcPr>
+            <w:tcW w:w="2337" w:type="dxa"/>
+          </w:tcPr>
+          <w:p>
+            <w:pPr>
+              <w:jc w:val="center"/>
+            </w:pPr>
+            <w:r>
+              <w:t>2</w:t>
+            </w:r>
+          </w:p>
+        </w:tc>
+        <w:tc>
+          <w:tcPr>
+            <w:tcW w:w="2337" w:type="dxa"/>
+          </w:tcPr>
+          <w:p>
+            <w:pPr>
+              <w:jc w:val="center"/>
+            </w:pPr>
+            <w:r>
+              <w:t>11%</w:t>
+            </w:r>
+          </w:p>
+        </w:tc>
+      </w:tr>
+      <w:tr>
+        <w:trPr>
+          <w:jc w:val="center"/>
+        </w:trPr>
+        <w:tc>
+          <w:tcPr>
+            <w:tcW w:w="2337" w:type="dxa"/>
+          </w:tcPr>
+          <w:p>
+            <w:pPr>
+              <w:jc w:val="center"/>
+            </w:pPr>
+            <w:r>
+              <w:t>Developer/IT</w:t>
+            </w:r>
+          </w:p>
+        </w:tc>
+        <w:tc>
+          <w:tcPr>
+            <w:tcW w:w="2337" w:type="dxa"/>
+          </w:tcPr>
+          <w:p>
+            <w:pPr>
+              <w:keepNext/>
+              <w:jc w:val="center"/>
+            </w:pPr>
+            <w:r>
+              <w:t>1</w:t>
+            </w:r>
+          </w:p>
+        </w:tc>
+        <w:tc>
+          <w:tcPr>
+            <w:tcW w:w="2337" w:type="dxa"/>
+          </w:tcPr>
+          <w:p>
+            <w:pPr>
+              <w:keepNext/>
+              <w:jc w:val="center"/>
+            </w:pPr>
+            <w:r>
+              <w:t>5%</w:t>
+            </w:r>
+          </w:p>
+        </w:tc>
+      </w:tr>
+    </w:tbl>
+    <w:p>
+      <w:pPr>
+        <w:pStyle w:val="Caption"/>
+        <w:jc w:val="center"/>
+        <w:rPr>
+          <w:i w:val="0"/>
+          <w:iCs w:val="0"/>
+          <w:color w:val="auto"/>
+        </w:rPr>
+      </w:pPr>
+      <w:bookmarkStart w:id="4" w:name="_Ref230939531"/>
+      <w:r>
+        <w:rPr>
+          <w:i w:val="0"/>
+          <w:iCs w:val="0"/>
+          <w:color w:val="auto"/>
+        </w:rPr>
+        <w:t xml:space="preserve">Table </w:t>
+      </w:r>
+      <w:r>
+        <w:rPr>
+          <w:i w:val="0"/>
+          <w:iCs w:val="0"/>
+          <w:color w:val="auto"/>
+        </w:rPr>
+        <w:fldChar w:fldCharType="begin"/>
+      </w:r>
+      <w:r>
+        <w:rPr>
+          <w:i w:val="0"/>
+          <w:iCs w:val="0"/>
+          <w:color w:val="auto"/>
+        </w:rPr>
+        <w:instrText xml:space="preserve"> SEQ Table \* ARABIC </w:instrText>
+      </w:r>
+      <w:r>
+        <w:rPr>
+          <w:i w:val="0"/>
+          <w:iCs w:val="0"/>
+          <w:color w:val="auto"/>
+        </w:rPr>
+        <w:fldChar w:fldCharType="separate"/>
+      </w:r>
+      <w:r>
+        <w:rPr>
+          <w:i w:val="0"/>
+          <w:iCs w:val="0"/>
+          <w:color w:val="auto"/>
+        </w:rPr>
+        <w:t>1</w:t>
+      </w:r>
+      <w:r>
+        <w:rPr>
+          <w:i w:val="0"/>
+          <w:iCs w:val="0"/>
+          <w:color w:val="auto"/>
+        </w:rPr>
+        <w:fldChar w:fldCharType="end"/>
+      </w:r>
+      <w:bookmarkEnd w:id="4"/>
+      <w:r>
+        <w:rPr>
+          <w:i w:val="0"/>
+          <w:iCs w:val="0"/>
+          <w:color w:val="auto"/>
+        </w:rPr>
+        <w:t>. Professional Role Mix of Delphi Panel</w:t>
+      </w:r>
+      <w:r>
+        <w:rPr>
+          <w:i w:val="0"/>
+          <w:iCs w:val="0"/>
+          <w:color w:val="auto"/>
+          <w:vertAlign w:val="superscript"/>
+        </w:rPr>
+        <w:footnoteReference w:id="4"/>
+      </w:r>
+    </w:p>
+    <w:tbl>
+      <w:tblPr>
+        <w:tblStyle w:val="TableGrid"/>
+        <w:tblW w:w="0" w:type="auto"/>
+        <w:tblInd w:w="1165" w:type="dxa"/>
+        <w:tblLook w:val="04A0" w:firstRow="1" w:lastRow="0" w:firstColumn="1" w:lastColumn="0" w:noHBand="0" w:noVBand="1"/>
+      </w:tblPr>
+      <w:tblGrid>
+        <w:gridCol w:w="2340"/>
+        <w:gridCol w:w="2340"/>
+        <w:gridCol w:w="2320"/>
+      </w:tblGrid>
+      <w:tr>
+        <w:trPr>
+          <w:trHeight w:val="241"/>
+        </w:trPr>
+        <w:tc>
+          <w:tcPr>
+            <w:tcW w:w="2340" w:type="dxa"/>
+          </w:tcPr>
+          <w:p>
+            <w:pPr>
+              <w:rPr>
+                <w:b/>
+                <w:bCs/>
+              </w:rPr>
+            </w:pPr>
+            <w:r>
+              <w:rPr>
+                <w:b/>
+                <w:bCs/>
+              </w:rPr>
+              <w:t>Tenure Range</w:t>
+            </w:r>
+          </w:p>
+        </w:tc>
+        <w:tc>
+          <w:tcPr>
+            <w:tcW w:w="2340" w:type="dxa"/>
+          </w:tcPr>
+          <w:p>
+            <w:pPr>
+              <w:rPr>
+                <w:b/>
+                <w:bCs/>
+              </w:rPr>
+            </w:pPr>
+            <w:r>
+              <w:rPr>
+                <w:b/>
+                <w:bCs/>
+              </w:rPr>
+              <w:t>Participant Count</w:t>
+            </w:r>
+          </w:p>
+        </w:tc>
+        <w:tc>
+          <w:tcPr>
+            <w:tcW w:w="2320" w:type="dxa"/>
+          </w:tcPr>
+          <w:p>
+            <w:pPr>
+              <w:rPr>
+                <w:b/>
+                <w:bCs/>
+              </w:rPr>
+            </w:pPr>
+            <w:r>
+              <w:rPr>
+                <w:b/>
+                <w:bCs/>
+              </w:rPr>
+              <w:t>Percentage (%)</w:t>
+            </w:r>
+          </w:p>
+        </w:tc>
+      </w:tr>
+      <w:tr>
+        <w:trPr>
+          <w:trHeight w:val="260"/>
+        </w:trPr>
+        <w:tc>
+          <w:tcPr>
+            <w:tcW w:w="2340" w:type="dxa"/>
+          </w:tcPr>
+          <w:p/>
+        </w:tc>
+        <w:tc>
+          <w:tcPr>
+            <w:tcW w:w="2340" w:type="dxa"/>
+          </w:tcPr>
+          <w:p/>
+        </w:tc>
+        <w:tc>
+          <w:tcPr>
+            <w:tcW w:w="2320" w:type="dxa"/>
+          </w:tcPr>
+          <w:p/>
+        </w:tc>
+      </w:tr>
+    </w:tbl>
+    <w:p>
+      <w:pPr>
+        <w:pStyle w:val="Heading3"/>
+      </w:pPr>
+      <w:bookmarkStart w:id="5" w:name="_heading=h.xw4c9cml9ir2" w:colFirst="0" w:colLast="0"/>
+      <w:bookmarkEnd w:id="5"/>
+      <w:r>
+        <w:lastRenderedPageBreak/>
+        <w:t>Derived requirements and use cases</w:t>
+      </w:r>
+    </w:p>
+    <w:p>
+      <w:pPr>
+        <w:pStyle w:val="Heading1"/>
+      </w:pPr>
+      <w:bookmarkStart w:id="6" w:name="_heading=h.3n1hn86yzluu" w:colFirst="0" w:colLast="0"/>
+      <w:bookmarkEnd w:id="6"/>
+      <w:r>
+        <w:t>DOMAIN-SPECIFIC LANGUAGE DESIGN</w:t>
+      </w:r>
+    </w:p>
+    <w:p>
+      <w:pPr>
+        <w:pStyle w:val="Heading3"/>
+      </w:pPr>
+      <w:r>
+        <w:t>Design goals and constraints</w:t>
+      </w:r>
+    </w:p>
+    <w:p>
+      <w:pPr>
+        <w:pStyle w:val="Heading3"/>
+      </w:pPr>
+      <w:r>
+        <w:t>Grammar specification</w:t>
+      </w:r>
+    </w:p>
+    <w:p>
+      <w:pPr>
+        <w:pStyle w:val="Heading3"/>
+      </w:pPr>
+      <w:r>
+        <w:t>Example DSL statements</w:t>
+      </w:r>
+    </w:p>
+    <w:p>
+      <w:pPr>
+        <w:pStyle w:val="Heading1"/>
+      </w:pPr>
+      <w:r>
+        <w:t>TRANSPILER IMPLEMENTATION</w:t>
+      </w:r>
+    </w:p>
+    <w:p>
+      <w:r>
+        <w:t>To implement this domain-specific language, the researchers used two (2) main technologies: Python (including the Lark parser framework</w:t>
+      </w:r>
+      <w:r>
+        <w:rPr>
+          <w:rStyle w:val="FootnoteReference"/>
+        </w:rPr>
+        <w:footnoteReference w:id="5"/>
+      </w:r>
+      <w:r>
+        <w:t xml:space="preserve">) and the SAS® OnDemand for Academics (SODA) environment. </w:t>
+      </w:r>
+      <w:r>
+        <w:t>The authors created a Python library that defines the grammar of the DSL, builds the lexer, parser, and transpiler, and then outputs valid SAS code. The code is then uploaded to SODA to check for execution errors and to retrieve any results.</w:t>
+      </w:r>
+    </w:p>
+    <w:p>
+      <w:pPr>
+        <w:pStyle w:val="Heading3"/>
+      </w:pPr>
+      <w:r>
+        <w:t>Parser and transpiler architecture</w:t>
+      </w:r>
+    </w:p>
+    <w:p>
+      <w:r>
+        <w:t xml:space="preserve">Transpiler process flow shown below: </w:t>
       </w:r>
     </w:p>
     <w:p>
       <w:pPr>
         <w:keepNext/>
-        <w:spacing w:line="276" w:lineRule="auto"/>
-        <w:jc w:val="center"/>
       </w:pPr>
       <w:r>
         <w:rPr>
           <w:noProof/>
         </w:rPr>
         <w:drawing>
-          <wp:inline distT="0" distB="0" distL="0" distR="0" wp14:anchorId="52D2A2E4" wp14:editId="57E280CD">
-            <wp:extent cx="3727450" cy="2184303"/>
-            <wp:effectExtent l="19050" t="19050" r="25400" b="26035"/>
-            <wp:docPr id="90381378" name="Picture 1"/>
+          <wp:inline distT="0" distB="0" distL="0" distR="0" wp14:anchorId="5B372CEB" wp14:editId="6578EE15">
+            <wp:extent cx="5934075" cy="2028825"/>
+            <wp:effectExtent l="19050" t="19050" r="28575" b="28575"/>
+            <wp:docPr id="1594055650" name="Picture 1"/>
             <wp:cNvGraphicFramePr>
               <a:graphicFrameLocks xmlns:a="http://schemas.openxmlformats.org/drawingml/2006/main" noChangeAspect="1"/>
             </wp:cNvGraphicFramePr>
@@ -468,24 +1160,34 @@
               <a:graphicData uri="http://schemas.openxmlformats.org/drawingml/2006/picture">
                 <pic:pic xmlns:pic="http://schemas.openxmlformats.org/drawingml/2006/picture">
                   <pic:nvPicPr>
-                    <pic:cNvPr id="90381378" name=""/>
-                    <pic:cNvPicPr/>
+                    <pic:cNvPr id="0" name="Picture 1"/>
+                    <pic:cNvPicPr>
+                      <a:picLocks noChangeAspect="1" noChangeArrowheads="1"/>
+                    </pic:cNvPicPr>
                   </pic:nvPicPr>
                   <pic:blipFill>
-                    <a:blip r:embed="rId9"/>
+                    <a:blip r:embed="rId9">
+                      <a:extLst>
+                        <a:ext uri="{28A0092B-C50C-407E-A947-70E740481C1C}">
+                          <a14:useLocalDpi xmlns:a14="http://schemas.microsoft.com/office/drawing/2010/main" val="0"/>
+                        </a:ext>
+                      </a:extLst>
+                    </a:blip>
+                    <a:srcRect/>
                     <a:stretch>
                       <a:fillRect/>
                     </a:stretch>
                   </pic:blipFill>
-                  <pic:spPr>
+                  <pic:spPr bwMode="auto">
                     <a:xfrm>
                       <a:off x="0" y="0"/>
-                      <a:ext cx="3730787" cy="2186258"/>
+                      <a:ext cx="5934075" cy="2028825"/>
                     </a:xfrm>
                     <a:prstGeom prst="rect">
                       <a:avLst/>
                     </a:prstGeom>
-                    <a:ln>
+                    <a:noFill/>
+                    <a:ln w="12700">
                       <a:solidFill>
                         <a:schemeClr val="tx1"/>
                       </a:solidFill>
@@ -506,19 +1208,13 @@
           <w:i w:val="0"/>
           <w:iCs w:val="0"/>
           <w:color w:val="auto"/>
-          <w:sz w:val="20"/>
-          <w:szCs w:val="20"/>
-        </w:rPr>
-      </w:pPr>
-      <w:bookmarkStart w:id="4" w:name="_Ref230708375"/>
-      <w:bookmarkStart w:id="5" w:name="_Ref230708367"/>
+        </w:rPr>
+      </w:pPr>
       <w:r>
         <w:rPr>
           <w:i w:val="0"/>
           <w:iCs w:val="0"/>
           <w:color w:val="auto"/>
-          <w:sz w:val="20"/>
-          <w:szCs w:val="20"/>
         </w:rPr>
         <w:t xml:space="preserve">Figure </w:t>
       </w:r>
@@ -527,8 +1223,6 @@
           <w:i w:val="0"/>
           <w:iCs w:val="0"/>
           <w:color w:val="auto"/>
-          <w:sz w:val="20"/>
-          <w:szCs w:val="20"/>
         </w:rPr>
         <w:fldChar w:fldCharType="begin"/>
       </w:r>
@@ -537,8 +1231,6 @@
           <w:i w:val="0"/>
           <w:iCs w:val="0"/>
           <w:color w:val="auto"/>
-          <w:sz w:val="20"/>
-          <w:szCs w:val="20"/>
         </w:rPr>
         <w:instrText xml:space="preserve"> SEQ Figure \* ARABIC </w:instrText>
       </w:r>
@@ -547,192 +1239,43 @@
           <w:i w:val="0"/>
           <w:iCs w:val="0"/>
           <w:color w:val="auto"/>
-          <w:sz w:val="20"/>
-          <w:szCs w:val="20"/>
         </w:rPr>
         <w:fldChar w:fldCharType="separate"/>
-      </w:r>
-      <w:r>
-        <w:rPr>
-          <w:i w:val="0"/>
-          <w:iCs w:val="0"/>
-          <w:noProof/>
-          <w:color w:val="auto"/>
-          <w:sz w:val="20"/>
-          <w:szCs w:val="20"/>
-        </w:rPr>
-        <w:t>1</w:t>
       </w:r>
       <w:r>
         <w:rPr>
           <w:i w:val="0"/>
           <w:iCs w:val="0"/>
           <w:color w:val="auto"/>
-          <w:sz w:val="20"/>
-          <w:szCs w:val="20"/>
-        </w:rPr>
-        <w:fldChar w:fldCharType="end"/>
-      </w:r>
-      <w:bookmarkEnd w:id="4"/>
+        </w:rPr>
+        <w:t>1</w:t>
+      </w:r>
       <w:r>
         <w:rPr>
           <w:i w:val="0"/>
           <w:iCs w:val="0"/>
           <w:color w:val="auto"/>
-          <w:sz w:val="20"/>
-          <w:szCs w:val="20"/>
-        </w:rPr>
-        <w:t xml:space="preserve"> - Professional Role Mix of Delphi Panel</w:t>
-      </w:r>
-      <w:bookmarkEnd w:id="5"/>
-    </w:p>
-    <w:p/>
-    <w:p>
-      <w:pPr>
-        <w:keepNext/>
-        <w:spacing w:line="276" w:lineRule="auto"/>
-        <w:jc w:val="center"/>
-      </w:pPr>
-      <w:r>
-        <w:rPr>
-          <w:noProof/>
-        </w:rPr>
-        <w:lastRenderedPageBreak/>
-        <w:drawing>
-          <wp:inline distT="0" distB="0" distL="0" distR="0" wp14:anchorId="58B7A78B" wp14:editId="10CE8E51">
-            <wp:extent cx="3530600" cy="2225861"/>
-            <wp:effectExtent l="19050" t="19050" r="12700" b="22225"/>
-            <wp:docPr id="81047221" name="Picture 1"/>
-            <wp:cNvGraphicFramePr>
-              <a:graphicFrameLocks xmlns:a="http://schemas.openxmlformats.org/drawingml/2006/main" noChangeAspect="1"/>
-            </wp:cNvGraphicFramePr>
-            <a:graphic xmlns:a="http://schemas.openxmlformats.org/drawingml/2006/main">
-              <a:graphicData uri="http://schemas.openxmlformats.org/drawingml/2006/picture">
-                <pic:pic xmlns:pic="http://schemas.openxmlformats.org/drawingml/2006/picture">
-                  <pic:nvPicPr>
-                    <pic:cNvPr id="81047221" name=""/>
-                    <pic:cNvPicPr/>
-                  </pic:nvPicPr>
-                  <pic:blipFill>
-                    <a:blip r:embed="rId10"/>
-                    <a:stretch>
-                      <a:fillRect/>
-                    </a:stretch>
-                  </pic:blipFill>
-                  <pic:spPr>
-                    <a:xfrm>
-                      <a:off x="0" y="0"/>
-                      <a:ext cx="3530600" cy="2225861"/>
-                    </a:xfrm>
-                    <a:prstGeom prst="rect">
-                      <a:avLst/>
-                    </a:prstGeom>
-                    <a:ln>
-                      <a:solidFill>
-                        <a:schemeClr val="tx1"/>
-                      </a:solidFill>
-                    </a:ln>
-                  </pic:spPr>
-                </pic:pic>
-              </a:graphicData>
-            </a:graphic>
-          </wp:inline>
-        </w:drawing>
-      </w:r>
-    </w:p>
-    <w:p>
-      <w:pPr>
-        <w:pStyle w:val="Caption"/>
-        <w:jc w:val="center"/>
+        </w:rPr>
+        <w:fldChar w:fldCharType="end"/>
+      </w:r>
+      <w:r>
         <w:rPr>
           <w:i w:val="0"/>
           <w:iCs w:val="0"/>
           <w:color w:val="auto"/>
-          <w:sz w:val="20"/>
-          <w:szCs w:val="20"/>
-        </w:rPr>
-      </w:pPr>
-      <w:bookmarkStart w:id="6" w:name="_Ref230708393"/>
-      <w:r>
-        <w:rPr>
-          <w:i w:val="0"/>
-          <w:iCs w:val="0"/>
-          <w:color w:val="auto"/>
-          <w:sz w:val="20"/>
-          <w:szCs w:val="20"/>
-        </w:rPr>
-        <w:t xml:space="preserve">Figure </w:t>
-      </w:r>
-      <w:r>
-        <w:rPr>
-          <w:i w:val="0"/>
-          <w:iCs w:val="0"/>
-          <w:color w:val="auto"/>
-          <w:sz w:val="20"/>
-          <w:szCs w:val="20"/>
-        </w:rPr>
-        <w:fldChar w:fldCharType="begin"/>
-      </w:r>
-      <w:r>
-        <w:rPr>
-          <w:i w:val="0"/>
-          <w:iCs w:val="0"/>
-          <w:color w:val="auto"/>
-          <w:sz w:val="20"/>
-          <w:szCs w:val="20"/>
-        </w:rPr>
-        <w:instrText xml:space="preserve"> SEQ Figure \* ARABIC </w:instrText>
-      </w:r>
-      <w:r>
-        <w:rPr>
-          <w:i w:val="0"/>
-          <w:iCs w:val="0"/>
-          <w:color w:val="auto"/>
-          <w:sz w:val="20"/>
-          <w:szCs w:val="20"/>
-        </w:rPr>
-        <w:fldChar w:fldCharType="separate"/>
-      </w:r>
-      <w:r>
-        <w:rPr>
-          <w:i w:val="0"/>
-          <w:iCs w:val="0"/>
-          <w:color w:val="auto"/>
-          <w:sz w:val="20"/>
-          <w:szCs w:val="20"/>
-        </w:rPr>
-        <w:t>2</w:t>
-      </w:r>
-      <w:r>
-        <w:rPr>
-          <w:i w:val="0"/>
-          <w:iCs w:val="0"/>
-          <w:color w:val="auto"/>
-          <w:sz w:val="20"/>
-          <w:szCs w:val="20"/>
-        </w:rPr>
-        <w:fldChar w:fldCharType="end"/>
-      </w:r>
-      <w:bookmarkEnd w:id="6"/>
-      <w:r>
-        <w:rPr>
-          <w:i w:val="0"/>
-          <w:iCs w:val="0"/>
-          <w:color w:val="auto"/>
-          <w:sz w:val="20"/>
-          <w:szCs w:val="20"/>
-        </w:rPr>
-        <w:t xml:space="preserve"> - Tenure Distribution of Delphi Panel</w:t>
+        </w:rPr>
+        <w:t>. Source DSL to SAS code transpiler process</w:t>
       </w:r>
     </w:p>
     <w:p>
       <w:pPr>
         <w:pStyle w:val="Heading3"/>
       </w:pPr>
-      <w:bookmarkStart w:id="7" w:name="_heading=h.xw4c9cml9ir2" w:colFirst="0" w:colLast="0"/>
-      <w:bookmarkEnd w:id="7"/>
-      <w:r>
-        <w:t>Results and thematic analysis</w:t>
+      <w:r>
+        <w:t>Transpiler</w:t>
+      </w:r>
+      <w:r>
+        <w:t xml:space="preserve"> strategy</w:t>
       </w:r>
     </w:p>
     <w:p>
@@ -740,17 +1283,15 @@
         <w:pStyle w:val="Heading3"/>
       </w:pPr>
       <w:r>
-        <w:t>Derived requirements and use cases</w:t>
+        <w:t>Handling complex functionality</w:t>
       </w:r>
     </w:p>
     <w:p>
       <w:pPr>
         <w:pStyle w:val="Heading1"/>
       </w:pPr>
-      <w:bookmarkStart w:id="8" w:name="_heading=h.3n1hn86yzluu" w:colFirst="0" w:colLast="0"/>
-      <w:bookmarkEnd w:id="8"/>
-      <w:r>
-        <w:t>DSL Design</w:t>
+      <w:r>
+        <w:t>EVALUATION OF RESULTS</w:t>
       </w:r>
     </w:p>
     <w:p>
@@ -758,7 +1299,7 @@
         <w:pStyle w:val="Heading3"/>
       </w:pPr>
       <w:r>
-        <w:t>Design goals and constraints</w:t>
+        <w:t>Use case demonstrations</w:t>
       </w:r>
     </w:p>
     <w:p>
@@ -766,7 +1307,7 @@
         <w:pStyle w:val="Heading3"/>
       </w:pPr>
       <w:r>
-        <w:t>Grammar specification</w:t>
+        <w:t>Verification of correctness</w:t>
       </w:r>
     </w:p>
     <w:p>
@@ -774,7 +1315,7 @@
         <w:pStyle w:val="Heading3"/>
       </w:pPr>
       <w:r>
-        <w:t>Example DSL statements</w:t>
+        <w:t>Coverage of derived requirements</w:t>
       </w:r>
     </w:p>
     <w:p>
@@ -782,12 +1323,15 @@
         <w:pStyle w:val="Heading1"/>
       </w:pPr>
       <w:r>
-        <w:t>Implementation</w:t>
-      </w:r>
-    </w:p>
-    <w:p>
-      <w:r>
-        <w:t xml:space="preserve">To implement this domain-specific language, the researchers used two (2) main technologies: Python (including the Lark parser framework) and the SAS® OnDemand for Academics (SODA) environment. </w:t>
+        <w:t>CONCLUSION</w:t>
+      </w:r>
+    </w:p>
+    <w:p>
+      <w:r>
+        <w:rPr>
+          <w:highlight w:val="yellow"/>
+        </w:rPr>
+        <w:t>Conclusions…</w:t>
       </w:r>
     </w:p>
     <w:p>
@@ -795,87 +1339,19 @@
         <w:pStyle w:val="Heading3"/>
       </w:pPr>
       <w:r>
-        <w:t>Parser and transpiler architecture</w:t>
-      </w:r>
-    </w:p>
-    <w:p>
-      <w:pPr>
-        <w:pStyle w:val="Heading3"/>
-      </w:pPr>
-      <w:r>
-        <w:t>Transpilation strategy</w:t>
-      </w:r>
-    </w:p>
-    <w:p>
-      <w:pPr>
-        <w:pStyle w:val="Heading3"/>
-      </w:pPr>
-      <w:r>
-        <w:t>Handling complex functionality</w:t>
-      </w:r>
-    </w:p>
-    <w:p>
-      <w:pPr>
-        <w:pStyle w:val="Heading1"/>
-      </w:pPr>
-      <w:r>
-        <w:t>Evaluation</w:t>
-      </w:r>
-      <w:r>
-        <w:t xml:space="preserve"> and Walkthrough</w:t>
-      </w:r>
-    </w:p>
-    <w:p>
-      <w:pPr>
-        <w:pStyle w:val="Heading3"/>
-      </w:pPr>
-      <w:r>
-        <w:t>Use case demonstrations</w:t>
-      </w:r>
-    </w:p>
-    <w:p>
-      <w:pPr>
-        <w:pStyle w:val="Heading3"/>
-      </w:pPr>
-      <w:r>
-        <w:t>Verification of correctness</w:t>
-      </w:r>
-    </w:p>
-    <w:p>
-      <w:pPr>
-        <w:pStyle w:val="Heading3"/>
-      </w:pPr>
-      <w:r>
-        <w:t>Coverage of derived requirements</w:t>
-      </w:r>
-    </w:p>
-    <w:p>
-      <w:pPr>
-        <w:pStyle w:val="Heading1"/>
-      </w:pPr>
-      <w:r>
-        <w:t>Conclusion</w:t>
-      </w:r>
-    </w:p>
-    <w:p>
-      <w:pPr>
-        <w:pStyle w:val="Heading3"/>
-      </w:pPr>
-      <w:r>
-        <w:t>Summary of Contributions</w:t>
-      </w:r>
-    </w:p>
-    <w:p>
-      <w:pPr>
-        <w:pStyle w:val="Heading3"/>
-      </w:pPr>
-      <w:r>
+        <w:lastRenderedPageBreak/>
         <w:t>Limitations</w:t>
       </w:r>
     </w:p>
     <w:p>
       <w:r>
-        <w:t xml:space="preserve">Given that this paper provides a proof-of-concept for this DSL, there are several limitations with the </w:t>
+        <w:t xml:space="preserve">Given that this paper provides </w:t>
+      </w:r>
+      <w:r>
+        <w:t>proof</w:t>
+      </w:r>
+      <w:r>
+        <w:t xml:space="preserve">-of-concept for this DSL, there are several limitations with the </w:t>
       </w:r>
       <w:r>
         <w:t xml:space="preserve">current </w:t>
@@ -893,7 +1369,6 @@
         </w:numPr>
       </w:pPr>
       <w:r>
-        <w:lastRenderedPageBreak/>
         <w:t>The execution model of this DSL exists solely as preprocessor directives</w:t>
       </w:r>
     </w:p>
@@ -1020,8 +1495,8 @@
       <w:pPr>
         <w:pStyle w:val="Heading1"/>
       </w:pPr>
-      <w:bookmarkStart w:id="9" w:name="_heading=h.cb9bfkp3n0ty" w:colFirst="0" w:colLast="0"/>
-      <w:bookmarkEnd w:id="9"/>
+      <w:bookmarkStart w:id="7" w:name="_heading=h.cb9bfkp3n0ty" w:colFirst="0" w:colLast="0"/>
+      <w:bookmarkEnd w:id="7"/>
       <w:r>
         <w:t>References</w:t>
       </w:r>
@@ -1031,21 +1506,23 @@
         <w:rPr>
           <w:highlight w:val="yellow"/>
         </w:rPr>
-        <w:t>References are in-progress</w:t>
-      </w:r>
-    </w:p>
-    <w:p>
+        <w:t xml:space="preserve">References are </w:t>
+      </w:r>
+      <w:proofErr w:type="gramStart"/>
       <w:r>
         <w:rPr>
           <w:highlight w:val="yellow"/>
         </w:rPr>
-        <w:t xml:space="preserve">[1] </w:t>
-      </w:r>
+        <w:t>in-progress</w:t>
+      </w:r>
+      <w:proofErr w:type="gramEnd"/>
+    </w:p>
+    <w:p>
       <w:r>
         <w:rPr>
           <w:highlight w:val="yellow"/>
         </w:rPr>
-        <w:t>Ruslan Mitkov, </w:t>
+        <w:t>[1] Ruslan Mitkov, </w:t>
       </w:r>
       <w:r>
         <w:rPr>
@@ -1089,7 +1566,7 @@
         </w:rPr>
         <w:t xml:space="preserve">, 2017. </w:t>
       </w:r>
-      <w:hyperlink r:id="rId11" w:history="1">
+      <w:hyperlink r:id="rId10" w:history="1">
         <w:r>
           <w:rPr>
             <w:rStyle w:val="Hyperlink"/>
@@ -1103,8 +1580,8 @@
       <w:pPr>
         <w:pStyle w:val="Heading1"/>
       </w:pPr>
-      <w:bookmarkStart w:id="10" w:name="_heading=h.hb5jtu4yn1aq" w:colFirst="0" w:colLast="0"/>
-      <w:bookmarkEnd w:id="10"/>
+      <w:bookmarkStart w:id="8" w:name="_heading=h.hb5jtu4yn1aq" w:colFirst="0" w:colLast="0"/>
+      <w:bookmarkEnd w:id="8"/>
       <w:r>
         <w:t>Acknowledgments</w:t>
       </w:r>
@@ -1199,7 +1676,7 @@
       <w:r>
         <w:t xml:space="preserve">SPP (née Southwest Power Pool) -- </w:t>
       </w:r>
-      <w:hyperlink r:id="rId12" w:history="1">
+      <w:hyperlink r:id="rId11" w:history="1">
         <w:r>
           <w:rPr>
             <w:rStyle w:val="Hyperlink"/>
@@ -1228,7 +1705,7 @@
       <w:r>
         <w:t xml:space="preserve">EIA -- </w:t>
       </w:r>
-      <w:hyperlink r:id="rId13" w:history="1">
+      <w:hyperlink r:id="rId12" w:history="1">
         <w:r>
           <w:rPr>
             <w:rStyle w:val="Hyperlink"/>
@@ -1260,9 +1737,18 @@
         </w:rPr>
       </w:pPr>
       <w:r>
-        <w:t xml:space="preserve">BizEE Degree Days -- </w:t>
-      </w:r>
-      <w:hyperlink r:id="rId14" w:history="1">
+        <w:t>“</w:t>
+      </w:r>
+      <w:r>
+        <w:t>BizEE</w:t>
+      </w:r>
+      <w:r>
+        <w:t>”</w:t>
+      </w:r>
+      <w:r>
+        <w:t xml:space="preserve"> Degree Days -- </w:t>
+      </w:r>
+      <w:hyperlink r:id="rId13" w:history="1">
         <w:r>
           <w:rPr>
             <w:rStyle w:val="Hyperlink"/>
@@ -1290,15 +1776,38 @@
         <w:t xml:space="preserve"> “Bart”</w:t>
       </w:r>
       <w:r>
-        <w:t xml:space="preserve"> Jablonski for inspiring excitement within him around SAS.</w:t>
+        <w:t xml:space="preserve"> </w:t>
+      </w:r>
+      <w:proofErr w:type="spellStart"/>
+      <w:r>
+        <w:t>Jabłoński</w:t>
+      </w:r>
+      <w:proofErr w:type="spellEnd"/>
+      <w:r>
+        <w:t xml:space="preserve"> </w:t>
+      </w:r>
+      <w:r>
+        <w:t xml:space="preserve">for inspiring excitement within him </w:t>
+      </w:r>
+      <w:r>
+        <w:t>for</w:t>
+      </w:r>
+      <w:r>
+        <w:t xml:space="preserve"> </w:t>
+      </w:r>
+      <w:r>
+        <w:t xml:space="preserve">learning </w:t>
+      </w:r>
+      <w:r>
+        <w:t>SAS.</w:t>
       </w:r>
     </w:p>
     <w:p>
       <w:pPr>
         <w:pStyle w:val="Heading1"/>
       </w:pPr>
-      <w:bookmarkStart w:id="11" w:name="_heading=h.hs7c92y1og9i" w:colFirst="0" w:colLast="0"/>
-      <w:bookmarkEnd w:id="11"/>
+      <w:bookmarkStart w:id="9" w:name="_heading=h.hs7c92y1og9i" w:colFirst="0" w:colLast="0"/>
+      <w:bookmarkEnd w:id="9"/>
       <w:r>
         <w:t>Recommended Reading</w:t>
       </w:r>
@@ -1329,8 +1838,8 @@
       <w:pPr>
         <w:pStyle w:val="Heading1"/>
       </w:pPr>
-      <w:bookmarkStart w:id="12" w:name="_heading=h.w80t7yem59fv" w:colFirst="0" w:colLast="0"/>
-      <w:bookmarkEnd w:id="12"/>
+      <w:bookmarkStart w:id="10" w:name="_heading=h.w80t7yem59fv" w:colFirst="0" w:colLast="0"/>
+      <w:bookmarkEnd w:id="10"/>
       <w:r>
         <w:t>Contact Information</w:t>
       </w:r>
@@ -1389,7 +1898,7 @@
       <w:r>
         <w:br/>
       </w:r>
-      <w:hyperlink r:id="rId15" w:history="1">
+      <w:hyperlink r:id="rId14" w:history="1">
         <w:r>
           <w:rPr>
             <w:rStyle w:val="Hyperlink"/>
@@ -1400,7 +1909,7 @@
       <w:r>
         <w:br/>
       </w:r>
-      <w:hyperlink r:id="rId16" w:history="1">
+      <w:hyperlink r:id="rId15" w:history="1">
         <w:r>
           <w:rPr>
             <w:rStyle w:val="Hyperlink"/>
@@ -1438,7 +1947,7 @@
       <w:r>
         <w:br/>
       </w:r>
-      <w:hyperlink r:id="rId17" w:history="1">
+      <w:hyperlink r:id="rId16" w:history="1">
         <w:r>
           <w:rPr>
             <w:rStyle w:val="Hyperlink"/>
@@ -1449,7 +1958,7 @@
       <w:r>
         <w:br/>
       </w:r>
-      <w:hyperlink r:id="rId18" w:history="1">
+      <w:hyperlink r:id="rId17" w:history="1">
         <w:r>
           <w:rPr>
             <w:rStyle w:val="Hyperlink"/>
@@ -1484,6 +1993,7 @@
         <w:spacing w:line="276" w:lineRule="auto"/>
       </w:pPr>
       <w:r>
+        <w:lastRenderedPageBreak/>
         <w:t xml:space="preserve">SAS and all other SAS Institute Inc. product or service names are registered trademarks of SAS Institute Inc. in the USA and other countries. ® indicates USA registration. </w:t>
       </w:r>
     </w:p>
@@ -1500,7 +2010,15 @@
         <w:spacing w:line="276" w:lineRule="auto"/>
       </w:pPr>
       <w:r>
-        <w:t>Other brand and product names are trademarks of their respective companies.</w:t>
+        <w:t xml:space="preserve">Other </w:t>
+      </w:r>
+      <w:proofErr w:type="gramStart"/>
+      <w:r>
+        <w:t>brand</w:t>
+      </w:r>
+      <w:proofErr w:type="gramEnd"/>
+      <w:r>
+        <w:t xml:space="preserve"> and product names are trademarks of their respective companies.</w:t>
       </w:r>
     </w:p>
     <w:p>
@@ -1523,15 +2041,15 @@
       </w:pPr>
     </w:p>
     <w:p>
-      <w:bookmarkStart w:id="13" w:name="bookmark=id.a6vnkmwz2k3y" w:colFirst="0" w:colLast="0"/>
-      <w:bookmarkStart w:id="14" w:name="_heading=h.ianfiendd7gt" w:colFirst="0" w:colLast="0"/>
-      <w:bookmarkEnd w:id="13"/>
-      <w:bookmarkEnd w:id="14"/>
+      <w:bookmarkStart w:id="11" w:name="bookmark=id.a6vnkmwz2k3y" w:colFirst="0" w:colLast="0"/>
+      <w:bookmarkStart w:id="12" w:name="_heading=h.ianfiendd7gt" w:colFirst="0" w:colLast="0"/>
+      <w:bookmarkEnd w:id="11"/>
+      <w:bookmarkEnd w:id="12"/>
     </w:p>
     <w:sectPr>
-      <w:footerReference w:type="even" r:id="rId19"/>
-      <w:footerReference w:type="default" r:id="rId20"/>
-      <w:footerReference w:type="first" r:id="rId21"/>
+      <w:footerReference w:type="even" r:id="rId18"/>
+      <w:footerReference w:type="default" r:id="rId19"/>
+      <w:footerReference w:type="first" r:id="rId20"/>
       <w:pgSz w:w="12240" w:h="15840"/>
       <w:pgMar w:top="1440" w:right="1440" w:bottom="1440" w:left="1440" w:header="720" w:footer="720" w:gutter="0"/>
       <w:pgNumType w:start="1"/>
@@ -1858,6 +2376,7 @@
       <w:hyperlink r:id="rId2" w:history="1">
         <w:r>
           <w:rPr>
+            <w:rStyle w:val="Hyperlink"/>
             <w:sz w:val="18"/>
             <w:szCs w:val="18"/>
           </w:rPr>
@@ -1866,10 +2385,267 @@
       </w:hyperlink>
       <w:r>
         <w:rPr>
+          <w:rStyle w:val="Hyperlink"/>
           <w:sz w:val="18"/>
           <w:szCs w:val="18"/>
         </w:rPr>
         <w:t>.</w:t>
+      </w:r>
+    </w:p>
+  </w:footnote>
+  <w:footnote w:id="4">
+    <w:p>
+      <w:pPr>
+        <w:pStyle w:val="FootnoteText"/>
+        <w:rPr>
+          <w:lang w:val="en-US"/>
+        </w:rPr>
+      </w:pPr>
+      <w:r>
+        <w:rPr>
+          <w:sz w:val="18"/>
+          <w:szCs w:val="18"/>
+        </w:rPr>
+        <w:footnoteRef/>
+      </w:r>
+      <w:r>
+        <w:rPr>
+          <w:sz w:val="18"/>
+          <w:szCs w:val="18"/>
+        </w:rPr>
+        <w:t xml:space="preserve"> Participants were allowed to select more than one role that applied to them (in </w:t>
+      </w:r>
+      <w:r>
+        <w:rPr>
+          <w:sz w:val="18"/>
+          <w:szCs w:val="18"/>
+        </w:rPr>
+        <w:fldChar w:fldCharType="begin"/>
+      </w:r>
+      <w:r>
+        <w:rPr>
+          <w:sz w:val="18"/>
+          <w:szCs w:val="18"/>
+        </w:rPr>
+        <w:instrText xml:space="preserve"> REF _Ref230939531 \h </w:instrText>
+      </w:r>
+      <w:r>
+        <w:rPr>
+          <w:sz w:val="18"/>
+          <w:szCs w:val="18"/>
+        </w:rPr>
+      </w:r>
+      <w:r>
+        <w:rPr>
+          <w:sz w:val="18"/>
+          <w:szCs w:val="18"/>
+        </w:rPr>
+        <w:instrText xml:space="preserve"> \* MERGEFORMAT </w:instrText>
+      </w:r>
+      <w:r>
+        <w:rPr>
+          <w:sz w:val="18"/>
+          <w:szCs w:val="18"/>
+        </w:rPr>
+        <w:fldChar w:fldCharType="separate"/>
+      </w:r>
+      <w:r>
+        <w:rPr>
+          <w:sz w:val="18"/>
+          <w:szCs w:val="18"/>
+        </w:rPr>
+        <w:t>Table 1</w:t>
+      </w:r>
+      <w:r>
+        <w:rPr>
+          <w:sz w:val="18"/>
+          <w:szCs w:val="18"/>
+        </w:rPr>
+        <w:fldChar w:fldCharType="end"/>
+      </w:r>
+      <w:r>
+        <w:rPr>
+          <w:sz w:val="18"/>
+          <w:szCs w:val="18"/>
+        </w:rPr>
+        <w:t>), so those that chose (Management) are also represented by other roles that they once performed.</w:t>
+      </w:r>
+    </w:p>
+  </w:footnote>
+  <w:footnote w:id="5">
+    <w:p>
+      <w:pPr>
+        <w:pStyle w:val="FootnoteText"/>
+        <w:rPr>
+          <w:lang w:val="en-US"/>
+        </w:rPr>
+      </w:pPr>
+      <w:r>
+        <w:rPr>
+          <w:rStyle w:val="FootnoteReference"/>
+          <w:sz w:val="18"/>
+          <w:szCs w:val="18"/>
+        </w:rPr>
+        <w:footnoteRef/>
+      </w:r>
+      <w:r>
+        <w:rPr>
+          <w:sz w:val="18"/>
+          <w:szCs w:val="18"/>
+        </w:rPr>
+        <w:t xml:space="preserve"> </w:t>
+      </w:r>
+      <w:r>
+        <w:rPr>
+          <w:sz w:val="18"/>
+          <w:szCs w:val="18"/>
+          <w:lang w:val="en-US"/>
+        </w:rPr>
+        <w:t xml:space="preserve">The terms </w:t>
+      </w:r>
+      <w:proofErr w:type="spellStart"/>
+      <w:r>
+        <w:rPr>
+          <w:i/>
+          <w:iCs/>
+          <w:sz w:val="18"/>
+          <w:szCs w:val="18"/>
+          <w:lang w:val="en-US"/>
+        </w:rPr>
+        <w:t>lexing</w:t>
+      </w:r>
+      <w:proofErr w:type="spellEnd"/>
+      <w:r>
+        <w:rPr>
+          <w:i/>
+          <w:iCs/>
+          <w:sz w:val="18"/>
+          <w:szCs w:val="18"/>
+          <w:lang w:val="en-US"/>
+        </w:rPr>
+        <w:t xml:space="preserve"> </w:t>
+      </w:r>
+      <w:r>
+        <w:rPr>
+          <w:sz w:val="18"/>
+          <w:szCs w:val="18"/>
+          <w:lang w:val="en-US"/>
+        </w:rPr>
+        <w:t xml:space="preserve">(tokenization) and </w:t>
+      </w:r>
+      <w:r>
+        <w:rPr>
+          <w:i/>
+          <w:iCs/>
+          <w:sz w:val="18"/>
+          <w:szCs w:val="18"/>
+          <w:lang w:val="en-US"/>
+        </w:rPr>
+        <w:t xml:space="preserve">parsing </w:t>
+      </w:r>
+      <w:r>
+        <w:rPr>
+          <w:sz w:val="18"/>
+          <w:szCs w:val="18"/>
+          <w:lang w:val="en-US"/>
+        </w:rPr>
+        <w:t xml:space="preserve">refer to distinct operations in computer science for working with text. A lexer takes an input string and breaks it up on a delimiter (usually a whitespace character) into atomic </w:t>
+      </w:r>
+      <w:r>
+        <w:rPr>
+          <w:i/>
+          <w:iCs/>
+          <w:sz w:val="18"/>
+          <w:szCs w:val="18"/>
+          <w:lang w:val="en-US"/>
+        </w:rPr>
+        <w:t xml:space="preserve">lexemes </w:t>
+      </w:r>
+      <w:r>
+        <w:rPr>
+          <w:sz w:val="18"/>
+          <w:szCs w:val="18"/>
+          <w:lang w:val="en-US"/>
+        </w:rPr>
+        <w:t xml:space="preserve">(e.g. </w:t>
+      </w:r>
+      <w:r>
+        <w:rPr>
+          <w:rFonts w:ascii="Courier New" w:hAnsi="Courier New" w:cs="Courier New"/>
+          <w:sz w:val="18"/>
+          <w:szCs w:val="18"/>
+          <w:lang w:val="en-US"/>
+        </w:rPr>
+        <w:t>“Brenda was the best programmer amongst us”</w:t>
+      </w:r>
+      <w:r>
+        <w:rPr>
+          <w:sz w:val="18"/>
+          <w:szCs w:val="18"/>
+          <w:lang w:val="en-US"/>
+        </w:rPr>
+        <w:t xml:space="preserve"> would be “lexed” as : </w:t>
+      </w:r>
+      <w:r>
+        <w:rPr>
+          <w:rFonts w:ascii="Courier New" w:hAnsi="Courier New" w:cs="Courier New"/>
+          <w:sz w:val="18"/>
+          <w:szCs w:val="18"/>
+          <w:lang w:val="en-US"/>
+        </w:rPr>
+        <w:t>[“Brenda”, “was”, “the”, “best”, “programmer”, “amongst”, “us”]</w:t>
+      </w:r>
+      <w:r>
+        <w:rPr>
+          <w:sz w:val="18"/>
+          <w:szCs w:val="18"/>
+          <w:lang w:val="en-US"/>
+        </w:rPr>
+        <w:t xml:space="preserve">). </w:t>
+      </w:r>
+      <w:r>
+        <w:rPr>
+          <w:i/>
+          <w:iCs/>
+          <w:sz w:val="18"/>
+          <w:szCs w:val="18"/>
+          <w:lang w:val="en-US"/>
+        </w:rPr>
+        <w:t xml:space="preserve">Parsing </w:t>
+      </w:r>
+      <w:r>
+        <w:rPr>
+          <w:sz w:val="18"/>
+          <w:szCs w:val="18"/>
+          <w:lang w:val="en-US"/>
+        </w:rPr>
+        <w:t xml:space="preserve">then takes this tokenized text and applies syntactic rules to </w:t>
+      </w:r>
+      <w:r>
+        <w:rPr>
+          <w:sz w:val="18"/>
+          <w:szCs w:val="18"/>
+          <w:lang w:val="en-US"/>
+        </w:rPr>
+        <w:t xml:space="preserve">it to develop a </w:t>
+      </w:r>
+      <w:r>
+        <w:rPr>
+          <w:i/>
+          <w:iCs/>
+          <w:sz w:val="18"/>
+          <w:szCs w:val="18"/>
+          <w:lang w:val="en-US"/>
+        </w:rPr>
+        <w:t xml:space="preserve">parse tree </w:t>
+      </w:r>
+      <w:r>
+        <w:rPr>
+          <w:sz w:val="18"/>
+          <w:szCs w:val="18"/>
+          <w:lang w:val="en-US"/>
+        </w:rPr>
+        <w:t>(i.e. identifying “Brenda” as the subject of the sentence and “was” as the verb).</w:t>
       </w:r>
     </w:p>
   </w:footnote>
@@ -3992,6 +4768,25 @@
       <w:color w:val="1F497D" w:themeColor="text2"/>
     </w:rPr>
   </w:style>
+  <w:style w:type="table" w:styleId="TableGrid">
+    <w:name w:val="Table Grid"/>
+    <w:basedOn w:val="TableNormal"/>
+    <w:uiPriority w:val="39"/>
+    <w:rsid w:val="007E7698"/>
+    <w:pPr>
+      <w:spacing w:after="0"/>
+    </w:pPr>
+    <w:tblPr>
+      <w:tblBorders>
+        <w:top w:val="single" w:sz="4" w:space="0" w:color="auto"/>
+        <w:left w:val="single" w:sz="4" w:space="0" w:color="auto"/>
+        <w:bottom w:val="single" w:sz="4" w:space="0" w:color="auto"/>
+        <w:right w:val="single" w:sz="4" w:space="0" w:color="auto"/>
+        <w:insideH w:val="single" w:sz="4" w:space="0" w:color="auto"/>
+        <w:insideV w:val="single" w:sz="4" w:space="0" w:color="auto"/>
+      </w:tblBorders>
+    </w:tblPr>
+  </w:style>
 </w:styles>
 </file>
 

</xml_diff>

<commit_message>
Work completed on 6/20 this weekend
</commit_message>
<xml_diff>
--- a/DSL_SEASUG-2026_Paper_Draft1.docx
+++ b/DSL_SEASUG-2026_Paper_Draft1.docx
@@ -71,7 +71,27 @@
           <w:sz w:val="26"/>
           <w:szCs w:val="26"/>
         </w:rPr>
-        <w:t>: from Domain Logic to SAS Code</w:t>
+        <w:t xml:space="preserve">: </w:t>
+      </w:r>
+      <w:r>
+        <w:rPr>
+          <w:b/>
+          <w:bCs/>
+          <w:color w:val="000000"/>
+          <w:sz w:val="26"/>
+          <w:szCs w:val="26"/>
+        </w:rPr>
+        <w:t>From</w:t>
+      </w:r>
+      <w:r>
+        <w:rPr>
+          <w:b/>
+          <w:bCs/>
+          <w:color w:val="000000"/>
+          <w:sz w:val="26"/>
+          <w:szCs w:val="26"/>
+        </w:rPr>
+        <w:t xml:space="preserve"> Domain Logic to SAS Code</w:t>
       </w:r>
     </w:p>
     <w:p>
@@ -92,7 +112,7 @@
           <w:sz w:val="22"/>
           <w:szCs w:val="22"/>
         </w:rPr>
-        <w:t xml:space="preserve">Eric C. Grasby, </w:t>
+        <w:t>Eric C. Grasby; Daniel Berleant</w:t>
       </w:r>
       <w:r>
         <w:rPr>
@@ -100,7 +120,7 @@
           <w:sz w:val="22"/>
           <w:szCs w:val="22"/>
         </w:rPr>
-        <w:t>SPP</w:t>
+        <w:t>;</w:t>
       </w:r>
       <w:r>
         <w:rPr>
@@ -108,15 +128,7 @@
           <w:sz w:val="22"/>
           <w:szCs w:val="22"/>
         </w:rPr>
-        <w:t>; Daniel Berleant, UA Little Rock</w:t>
-      </w:r>
-      <w:r>
-        <w:rPr>
-          <w:color w:val="000000"/>
-          <w:sz w:val="22"/>
-          <w:szCs w:val="22"/>
-        </w:rPr>
-        <w:t>, Maria CB Gingras, SPP</w:t>
+        <w:t xml:space="preserve"> Maria CB Gingras</w:t>
       </w:r>
     </w:p>
     <w:p>
@@ -164,13 +176,25 @@
         <w:t xml:space="preserve">help </w:t>
       </w:r>
       <w:r>
-        <w:t xml:space="preserve">a monitoring analyst </w:t>
+        <w:t xml:space="preserve">a </w:t>
+      </w:r>
+      <w:r>
+        <w:t xml:space="preserve">market monitor </w:t>
       </w:r>
       <w:r>
         <w:t xml:space="preserve">declare </w:t>
       </w:r>
       <w:r>
-        <w:t>. It then transpiles their output into valid SAS code, leveraging SAS data sets for data management and SAS procedures, DATA step programming, and SAS macros to handle complex functionality.</w:t>
+        <w:t>the metrics that they wish to analyze</w:t>
+      </w:r>
+      <w:r>
+        <w:t>. It then transpiles their output into valid SAS code, leveraging SAS data sets for data management and SAS procedures, DATA step programming, and SAS macros to</w:t>
+      </w:r>
+      <w:r>
+        <w:t xml:space="preserve"> filter technical complexity out of the DSL logic</w:t>
+      </w:r>
+      <w:r>
+        <w:t>.</w:t>
       </w:r>
     </w:p>
     <w:p>
@@ -178,7 +202,13 @@
         <w:t>Finally, this paper illustrates</w:t>
       </w:r>
       <w:r>
-        <w:t xml:space="preserve"> the flexibility of this proposed design by</w:t>
+        <w:t xml:space="preserve"> the flexibility </w:t>
+      </w:r>
+      <w:r>
+        <w:t xml:space="preserve">and generalizability </w:t>
+      </w:r>
+      <w:r>
+        <w:t>of this proposed design by</w:t>
       </w:r>
       <w:r>
         <w:t xml:space="preserve"> demonstrating how a user can generate SAS code to fulfill common market monitoring tasks</w:t>
@@ -264,13 +294,13 @@
       <w:r>
         <w:t xml:space="preserve"> by an energy market monitoring authority. Market monitors are the group of professionals that work to ensure that these markets remain fair, efficient, and open access.</w:t>
       </w:r>
-    </w:p>
-    <w:p>
-      <w:r>
-        <w:rPr>
-          <w:highlight w:val="yellow"/>
-        </w:rPr>
-        <w:t>Finish introduction and framing to introduce the idea of a domain-specific language (and explain what a DSL is)</w:t>
+      <w:r>
+        <w:t xml:space="preserve"> By analyzing the detailed data generated by electricity markets, market monitors can scrutinize market transactions and identify malfeasance in physical and virtual power trades as well as opportunities for improvement to market design.</w:t>
+      </w:r>
+    </w:p>
+    <w:p>
+      <w:r>
+        <w:t>Ideally market monitors should be well versed in energy and market policy concepts. However, the nature of the current job landscape also dictates that they possess technical skills in programming and data analysis. The design outlined in this paper intends to put power back in the hands of market monitors. Rather than requiring them to maintain a technical programming skillset, we present a foundation for a domain-specific language (DSL) that allows market monitors to express their analytics in notations better suited to energy data. The language then translates these notations into valid SAS code which can process the energy market data on behalf of the analyst.</w:t>
       </w:r>
     </w:p>
     <w:p>
@@ -313,7 +343,13 @@
     </w:p>
     <w:p>
       <w:r>
-        <w:t xml:space="preserve">Systems such as SAS already provide an abstraction layer for data processing – why propose to build a DSL on top of SAS at all? The answer to this question lies in the energy data landscape itself. Although the BES is operationally complex, the surrounding data infrastructure is even more fragmented. Market monitors routinely interact with disparate systems, siloed databases, undocumented schemas, and numerous other information quality issues that impede their analysis. </w:t>
+        <w:t xml:space="preserve">Systems such as SAS already provide an abstraction layer for data processing – why propose to build a DSL on top of SAS at all? The answer to this question lies in the energy data landscape itself. Although the BES is operationally complex, the surrounding data infrastructure is even more fragmented. Market monitors routinely interact with disparate systems, siloed databases, undocumented schemas, and numerous other information quality issues that </w:t>
+      </w:r>
+      <w:r>
+        <w:t xml:space="preserve">can </w:t>
+      </w:r>
+      <w:r>
+        <w:t xml:space="preserve">impede their analysis. </w:t>
       </w:r>
     </w:p>
     <w:p>
@@ -328,7 +364,13 @@
         <w:t>semantic problems</w:t>
       </w:r>
       <w:r>
-        <w:t xml:space="preserve">, requiring an individual to encode their domain expertise into SAS or SQL scripts. A prevalent example in energy markets involves how timestamps are interpreted across time zones. Because energy market transactions span across time zones, timestamps on these transactions may be recorded in local time, adjacent market time, or Coordinated Universal Time (UTC/GMT). If the time zone metadata is not readily apparent, analytical queries may produce </w:t>
+        <w:t xml:space="preserve">, requiring an individual to encode their domain expertise into SAS or SQL scripts. A prevalent example in energy markets involves how timestamps are interpreted across time zones. Because energy market transactions </w:t>
+      </w:r>
+      <w:r>
+        <w:t xml:space="preserve">can </w:t>
+      </w:r>
+      <w:r>
+        <w:t xml:space="preserve">span across time zones, timestamps on these transactions may be recorded in local time, adjacent market time, or Coordinated Universal Time (UTC/GMT). If the time zone metadata is not readily apparent, analytical queries may produce </w:t>
       </w:r>
       <w:r>
         <w:rPr>
@@ -353,7 +395,14 @@
     </w:p>
     <w:p>
       <w:r>
-        <w:t>Modern analytics platforms provide mechanisms for performing these conversions, but they tend to rely on the user understanding and correctly applying the domain-level semantics associated with the data (using the appropriate time zone, for example). By leveraging metadata and domain-aware rules, the DSL can transparently handle these operations without requiring the user to manually account for such details.</w:t>
+        <w:lastRenderedPageBreak/>
+        <w:t xml:space="preserve">Modern analytics platforms provide mechanisms for performing these conversions, but they tend to rely on the user understanding and correctly applying the domain-level semantics associated with the data (using the appropriate time zone, for example). By leveraging metadata and domain-aware rules, </w:t>
+      </w:r>
+      <w:r>
+        <w:t>a</w:t>
+      </w:r>
+      <w:r>
+        <w:t xml:space="preserve"> DSL can transparently handle these operations without requiring the user to manually account for such details.</w:t>
       </w:r>
     </w:p>
     <w:p>
@@ -372,7 +421,6 @@
         <w:pStyle w:val="Heading3"/>
       </w:pPr>
       <w:r>
-        <w:lastRenderedPageBreak/>
         <w:t>Why SAS</w:t>
       </w:r>
       <w:r>
@@ -413,7 +461,13 @@
     </w:p>
     <w:p>
       <w:r>
-        <w:t xml:space="preserve">The SAS ecosystem satisfies each of these system requirements. BASE SAS and SAS/ACCESS provide mechanisms for </w:t>
+        <w:t>The SAS ecosystem satisfies each of these system requirements. B</w:t>
+      </w:r>
+      <w:r>
+        <w:t>ase</w:t>
+      </w:r>
+      <w:r>
+        <w:t xml:space="preserve"> SAS and SAS/ACCESS provide mechanisms for </w:t>
       </w:r>
       <w:r>
         <w:t>processing data, as well as importing and</w:t>
@@ -467,7 +521,13 @@
         <w:t xml:space="preserve">other </w:t>
       </w:r>
       <w:r>
-        <w:t xml:space="preserve">SAS components. BASE SAS also ships with a data typing system, so the upstream DSL does not have to enforce strict typing as part of the syntax (which translates to less cognitive burden on the user). </w:t>
+        <w:t xml:space="preserve">SAS components. </w:t>
+      </w:r>
+      <w:r>
+        <w:t>Base</w:t>
+      </w:r>
+      <w:r>
+        <w:t xml:space="preserve"> SAS also ships with a data typing system, so the upstream DSL does not have to enforce strict typing as part of the syntax (which translates to less cognitive burden on the user). </w:t>
       </w:r>
     </w:p>
     <w:p>
@@ -480,7 +540,10 @@
         <w:t xml:space="preserve">With each of these infrastructural components available within one platform, </w:t>
       </w:r>
       <w:r>
-        <w:t>the DSL</w:t>
+        <w:t>a</w:t>
+      </w:r>
+      <w:r>
+        <w:t xml:space="preserve"> DSL</w:t>
       </w:r>
       <w:r>
         <w:t xml:space="preserve"> can remain focused on allowing the user to write intuitive data logic. </w:t>
@@ -495,7 +558,7 @@
         <w:t xml:space="preserve"> any </w:t>
       </w:r>
       <w:r>
-        <w:t>infrastructural</w:t>
+        <w:t>technical</w:t>
       </w:r>
       <w:r>
         <w:t xml:space="preserve"> complexity to SAS and return results and error messages back to the user.</w:t>
@@ -618,6 +681,7 @@
         <w:t>professional role mix of the panelists, indicating that market monitoring analysts make up the largest portion of the panelists, with a mix of other roles including management, economists, data scientists, and a developer.</w:t>
       </w:r>
     </w:p>
+    <w:p/>
     <w:tbl>
       <w:tblPr>
         <w:tblStyle w:val="TableGrid"/>
@@ -938,7 +1002,6 @@
           <w:iCs w:val="0"/>
           <w:color w:val="auto"/>
         </w:rPr>
-        <w:lastRenderedPageBreak/>
         <w:t xml:space="preserve">Table </w:t>
       </w:r>
       <w:r>
@@ -1003,10 +1066,25 @@
     </w:p>
     <w:p>
       <w:r>
-        <w:rPr>
-          <w:highlight w:val="yellow"/>
-        </w:rPr>
-        <w:t>Discuss the tenure range of the panelists to give credit to why the participants were positioned as experts to provide their opinions.</w:t>
+        <w:t xml:space="preserve">In addition to a varied representational mix of professional market monitors, the Delphi participants also varied in their “length of tenure” at a market monitoring position. </w:t>
+      </w:r>
+      <w:r>
+        <w:fldChar w:fldCharType="begin"/>
+      </w:r>
+      <w:r>
+        <w:instrText xml:space="preserve"> REF _Ref232862163 \h </w:instrText>
+      </w:r>
+      <w:r>
+        <w:fldChar w:fldCharType="separate"/>
+      </w:r>
+      <w:r>
+        <w:t>Table 2</w:t>
+      </w:r>
+      <w:r>
+        <w:fldChar w:fldCharType="end"/>
+      </w:r>
+      <w:r>
+        <w:t xml:space="preserve"> identifies the tenure ranges of the participants. Panelists ranged in experience from fresh analysts (0-2 years, 16% of the initial panel) to a full career in energy market monitoring (greater than 20 years of experience, 11% of the initial panel). This panelist cross-section helps to ensure that the requirements developed for the DSL are applicable to a wider range of users.</w:t>
       </w:r>
     </w:p>
     <w:tbl>
@@ -1319,6 +1397,7 @@
         </w:rPr>
       </w:pPr>
       <w:bookmarkStart w:id="5" w:name="_heading=h.xw4c9cml9ir2" w:colFirst="0" w:colLast="0"/>
+      <w:bookmarkStart w:id="6" w:name="_Ref232862163"/>
       <w:bookmarkEnd w:id="5"/>
       <w:r>
         <w:rPr>
@@ -1368,6 +1447,7 @@
         </w:rPr>
         <w:fldChar w:fldCharType="end"/>
       </w:r>
+      <w:bookmarkEnd w:id="6"/>
       <w:r>
         <w:rPr>
           <w:i w:val="0"/>
@@ -1458,8 +1538,8 @@
           <w:szCs w:val="24"/>
         </w:rPr>
       </w:pPr>
-      <w:bookmarkStart w:id="6" w:name="_heading=h.3n1hn86yzluu" w:colFirst="0" w:colLast="0"/>
-      <w:bookmarkEnd w:id="6"/>
+      <w:bookmarkStart w:id="7" w:name="_heading=h.3n1hn86yzluu" w:colFirst="0" w:colLast="0"/>
+      <w:bookmarkEnd w:id="7"/>
       <w:r>
         <w:br w:type="page"/>
       </w:r>
@@ -2053,7 +2133,19 @@
         <w:t>This paper presents a practical foundation for translating a custom domain-specific language into valid SAS code. Given the identified limitations of this current approach, the authors believe that the following areas are possible opportunities for future work on this system</w:t>
       </w:r>
       <w:r>
-        <w:t>. These future work topics include: integrating language server protocol support, enhancing the current error handling feedback from the transpiler layer, and integrating the generated SAS output with a SAS runtime environment.</w:t>
+        <w:t xml:space="preserve">. </w:t>
+      </w:r>
+      <w:r>
+        <w:t>Such</w:t>
+      </w:r>
+      <w:r>
+        <w:t xml:space="preserve"> future work topics include</w:t>
+      </w:r>
+      <w:r>
+        <w:t xml:space="preserve"> (but are not limited to): </w:t>
+      </w:r>
+      <w:r>
+        <w:t>integrating language server protocol support, enhancing the current error handling feedback from the transpiler layer, and integrating the generated SAS output with a SAS runtime environment.</w:t>
       </w:r>
     </w:p>
     <w:p>
@@ -2087,8 +2179,8 @@
       <w:pPr>
         <w:pStyle w:val="Heading1"/>
       </w:pPr>
-      <w:bookmarkStart w:id="7" w:name="_heading=h.cb9bfkp3n0ty" w:colFirst="0" w:colLast="0"/>
-      <w:bookmarkEnd w:id="7"/>
+      <w:bookmarkStart w:id="8" w:name="_heading=h.cb9bfkp3n0ty" w:colFirst="0" w:colLast="0"/>
+      <w:bookmarkEnd w:id="8"/>
       <w:r>
         <w:t>REFERENCES</w:t>
       </w:r>
@@ -2208,8 +2300,8 @@
       <w:pPr>
         <w:pStyle w:val="Heading1"/>
       </w:pPr>
-      <w:bookmarkStart w:id="8" w:name="_heading=h.hb5jtu4yn1aq" w:colFirst="0" w:colLast="0"/>
-      <w:bookmarkEnd w:id="8"/>
+      <w:bookmarkStart w:id="9" w:name="_heading=h.hb5jtu4yn1aq" w:colFirst="0" w:colLast="0"/>
+      <w:bookmarkEnd w:id="9"/>
       <w:r>
         <w:t>ACKNOWLEDGMENTS</w:t>
       </w:r>
@@ -2432,8 +2524,8 @@
       <w:pPr>
         <w:pStyle w:val="Heading1"/>
       </w:pPr>
-      <w:bookmarkStart w:id="9" w:name="_heading=h.hs7c92y1og9i" w:colFirst="0" w:colLast="0"/>
-      <w:bookmarkEnd w:id="9"/>
+      <w:bookmarkStart w:id="10" w:name="_heading=h.hs7c92y1og9i" w:colFirst="0" w:colLast="0"/>
+      <w:bookmarkEnd w:id="10"/>
       <w:r>
         <w:lastRenderedPageBreak/>
         <w:t>RECOMMENDED READING</w:t>
@@ -2506,8 +2598,8 @@
       <w:pPr>
         <w:pStyle w:val="Heading1"/>
       </w:pPr>
-      <w:bookmarkStart w:id="10" w:name="_heading=h.w80t7yem59fv" w:colFirst="0" w:colLast="0"/>
-      <w:bookmarkEnd w:id="10"/>
+      <w:bookmarkStart w:id="11" w:name="_heading=h.w80t7yem59fv" w:colFirst="0" w:colLast="0"/>
+      <w:bookmarkEnd w:id="11"/>
       <w:r>
         <w:t>CONTACT INFORMATION</w:t>
       </w:r>
@@ -2741,10 +2833,10 @@
       <w:pPr>
         <w:pStyle w:val="Heading1"/>
       </w:pPr>
-      <w:bookmarkStart w:id="11" w:name="bookmark=id.a6vnkmwz2k3y" w:colFirst="0" w:colLast="0"/>
-      <w:bookmarkStart w:id="12" w:name="_heading=h.ianfiendd7gt" w:colFirst="0" w:colLast="0"/>
-      <w:bookmarkEnd w:id="11"/>
+      <w:bookmarkStart w:id="12" w:name="bookmark=id.a6vnkmwz2k3y" w:colFirst="0" w:colLast="0"/>
+      <w:bookmarkStart w:id="13" w:name="_heading=h.ianfiendd7gt" w:colFirst="0" w:colLast="0"/>
       <w:bookmarkEnd w:id="12"/>
+      <w:bookmarkEnd w:id="13"/>
       <w:r>
         <w:t>Appendix</w:t>
       </w:r>
@@ -5808,6 +5900,28 @@
       </w:tblBorders>
     </w:tblPr>
   </w:style>
+  <w:style w:type="paragraph" w:styleId="Header">
+    <w:name w:val="header"/>
+    <w:basedOn w:val="Normal"/>
+    <w:link w:val="HeaderChar"/>
+    <w:uiPriority w:val="99"/>
+    <w:unhideWhenUsed/>
+    <w:rsid w:val="003D1B82"/>
+    <w:pPr>
+      <w:tabs>
+        <w:tab w:val="center" w:pos="4680"/>
+        <w:tab w:val="right" w:pos="9360"/>
+      </w:tabs>
+      <w:spacing w:after="0"/>
+    </w:pPr>
+  </w:style>
+  <w:style w:type="character" w:customStyle="1" w:styleId="HeaderChar">
+    <w:name w:val="Header Char"/>
+    <w:basedOn w:val="DefaultParagraphFont"/>
+    <w:link w:val="Header"/>
+    <w:uiPriority w:val="99"/>
+    <w:rsid w:val="003D1B82"/>
+  </w:style>
 </w:styles>
 </file>
 

</xml_diff>